<commit_message>
Manual: drop lattice/homogenization refs, add install-from-food4Rhino + links
</commit_message>
<xml_diff>
--- a/docs/manual/Cushion_Manual.docx
+++ b/docs/manual/Cushion_Manual.docx
@@ -826,6 +826,121 @@
     </w:p>
     <w:p>
       <w:pPr>
+        <w:pStyle w:val="Heading2"/>
+        <w:spacing w:after="200" w:before="240"/>
+      </w:pPr>
+      <w:r>
+        <w:rPr>
+          <w:rFonts w:ascii="Helvetica" w:cs="Helvetica" w:eastAsia="Helvetica" w:hAnsi="Helvetica"/>
+        </w:rPr>
+        <w:t xml:space="preserve">Installing Cushion</w:t>
+      </w:r>
+    </w:p>
+    <w:p>
+      <w:pPr>
+        <w:spacing w:after="140"/>
+      </w:pPr>
+      <w:r>
+        <w:rPr>
+          <w:rFonts w:ascii="Helvetica" w:cs="Helvetica" w:eastAsia="Helvetica" w:hAnsi="Helvetica"/>
+          <w:sz w:val="22"/>
+          <w:szCs w:val="22"/>
+        </w:rPr>
+        <w:t xml:space="preserve">-  From the Rhino Package Manager: run the _PackageManager command, search for Cushion, install, restart Rhino. The Cushion tab appears in Grasshopper.</w:t>
+      </w:r>
+    </w:p>
+    <w:p>
+      <w:pPr>
+        <w:spacing w:after="140"/>
+      </w:pPr>
+      <w:r>
+        <w:rPr>
+          <w:rFonts w:ascii="Helvetica" w:cs="Helvetica" w:eastAsia="Helvetica" w:hAnsi="Helvetica"/>
+          <w:sz w:val="22"/>
+          <w:szCs w:val="22"/>
+        </w:rPr>
+        <w:t xml:space="preserve">-  Or manually from food4Rhino: download the .gha file, then in Grasshopper open File &gt; Special Folders &gt; Components Folder, copy the .gha there. On Windows, right-click the downloaded file &gt; Properties &gt; Unblock before copying. Restart Rhino.</w:t>
+      </w:r>
+    </w:p>
+    <w:p>
+      <w:pPr>
+        <w:pStyle w:val="Heading2"/>
+        <w:spacing w:after="200" w:before="240"/>
+      </w:pPr>
+      <w:r>
+        <w:rPr>
+          <w:rFonts w:ascii="Helvetica" w:cs="Helvetica" w:eastAsia="Helvetica" w:hAnsi="Helvetica"/>
+        </w:rPr>
+        <w:t xml:space="preserve">Links</w:t>
+      </w:r>
+    </w:p>
+    <w:p>
+      <w:pPr>
+        <w:spacing w:after="100"/>
+      </w:pPr>
+      <w:r>
+        <w:rPr>
+          <w:rFonts w:ascii="Helvetica" w:cs="Helvetica" w:eastAsia="Helvetica" w:hAnsi="Helvetica"/>
+          <w:sz w:val="22"/>
+          <w:szCs w:val="22"/>
+        </w:rPr>
+        <w:t xml:space="preserve">-  Rhino 8: www.rhino3d.com</w:t>
+      </w:r>
+    </w:p>
+    <w:p>
+      <w:pPr>
+        <w:spacing w:after="100"/>
+      </w:pPr>
+      <w:r>
+        <w:rPr>
+          <w:rFonts w:ascii="Helvetica" w:cs="Helvetica" w:eastAsia="Helvetica" w:hAnsi="Helvetica"/>
+          <w:sz w:val="22"/>
+          <w:szCs w:val="22"/>
+        </w:rPr>
+        <w:t xml:space="preserve">-  SOFA v24.06 binaries: www.sofa-framework.org/download</w:t>
+      </w:r>
+    </w:p>
+    <w:p>
+      <w:pPr>
+        <w:spacing w:after="100"/>
+      </w:pPr>
+      <w:r>
+        <w:rPr>
+          <w:rFonts w:ascii="Helvetica" w:cs="Helvetica" w:eastAsia="Helvetica" w:hAnsi="Helvetica"/>
+          <w:sz w:val="22"/>
+          <w:szCs w:val="22"/>
+        </w:rPr>
+        <w:t xml:space="preserve">-  Python 3.10 (python.org installer): www.python.org/downloads/release/python-31011</w:t>
+      </w:r>
+    </w:p>
+    <w:p>
+      <w:pPr>
+        <w:spacing w:after="100"/>
+      </w:pPr>
+      <w:r>
+        <w:rPr>
+          <w:rFonts w:ascii="Helvetica" w:cs="Helvetica" w:eastAsia="Helvetica" w:hAnsi="Helvetica"/>
+          <w:sz w:val="22"/>
+          <w:szCs w:val="22"/>
+        </w:rPr>
+        <w:t xml:space="preserve">-  Cushion repository &amp; issues: [repository URL]</w:t>
+      </w:r>
+    </w:p>
+    <w:p>
+      <w:pPr>
+        <w:spacing w:after="100"/>
+      </w:pPr>
+      <w:r>
+        <w:rPr>
+          <w:rFonts w:ascii="Helvetica" w:cs="Helvetica" w:eastAsia="Helvetica" w:hAnsi="Helvetica"/>
+          <w:sz w:val="22"/>
+          <w:szCs w:val="22"/>
+        </w:rPr>
+        <w:t xml:space="preserve">-  Manual, examples, install guides: [repository URL]/docs</w:t>
+      </w:r>
+    </w:p>
+    <w:p>
+      <w:pPr>
         <w:spacing w:after="80"/>
         <w:jc w:val="left"/>
       </w:pPr>
@@ -876,20 +991,6 @@
           <w:szCs w:val="22"/>
         </w:rPr>
         <w:t xml:space="preserve">Millimeters, kilopascals, kilograms, seconds. Gravity -9810 mm/s2 in world Z. Geometry passes from Rhino to SOFA 1:1 -- no transform, no unit conversion. The Rhino document must be in millimeters.</w:t>
-      </w:r>
-    </w:p>
-    <w:p>
-      <w:pPr>
-        <w:spacing w:after="200"/>
-        <w:jc w:val="left"/>
-      </w:pPr>
-      <w:r>
-        <w:rPr>
-          <w:rFonts w:ascii="Helvetica" w:cs="Helvetica" w:eastAsia="Helvetica" w:hAnsi="Helvetica"/>
-          <w:sz w:val="22"/>
-          <w:szCs w:val="22"/>
-        </w:rPr>
-        <w:t xml:space="preserve">Young's moduli are effective values: for architected/lattice bodies, use the homogenized modulus of the structure, and send detailed lattice geometry to the display-only visual inputs.</w:t>
       </w:r>
     </w:p>
     <w:p>
@@ -1891,7 +1992,7 @@
           <w:sz w:val="22"/>
           <w:szCs w:val="22"/>
         </w:rPr>
-        <w:t xml:space="preserve">The deformable finite-element body. Provide a closed solid (Brep preferred) or an existing mesh file; Cushion tet-meshes it via Gmsh and assigns homogenized material properties. All actuation, fixation, monitoring, and display elements attach to a body.</w:t>
+        <w:t xml:space="preserve">The deformable finite-element body. Provide a closed solid (Brep preferred) or an existing mesh file; Cushion tet-meshes it via Gmsh and assigns the material properties. All actuation, fixation, monitoring, and display elements attach to a body.</w:t>
       </w:r>
     </w:p>
     <w:p>
@@ -2365,7 +2466,7 @@
                 <w:sz w:val="18"/>
                 <w:szCs w:val="18"/>
               </w:rPr>
-              <w:t xml:space="preserve">Effective Young's modulus, kPa. Use the homogenized value for lattice bodies.</w:t>
+              <w:t xml:space="preserve">Young's modulus, kPa.</w:t>
             </w:r>
           </w:p>
         </w:tc>
@@ -3311,7 +3412,7 @@
                 <w:sz w:val="18"/>
                 <w:szCs w:val="18"/>
               </w:rPr>
-              <w:t xml:space="preserve">Display-only surfaces (e.g. a lattice), deformed with the body but never simulated.</w:t>
+              <w:t xml:space="preserve">Display-only surfaces, deformed with the body but never simulated.</w:t>
             </w:r>
           </w:p>
         </w:tc>
@@ -3808,36 +3909,6 @@
         </w:tc>
       </w:tr>
     </w:tbl>
-    <w:p>
-      <w:pPr>
-        <w:spacing w:after="100"/>
-        <w:jc w:val="left"/>
-      </w:pPr>
-      <w:r>
-        <w:rPr>
-          <w:rFonts w:ascii="Helvetica" w:cs="Helvetica" w:eastAsia="Helvetica" w:hAnsi="Helvetica"/>
-          <w:sz w:val="22"/>
-          <w:szCs w:val="22"/>
-        </w:rPr>
-        <w:t xml:space="preserve"/>
-      </w:r>
-    </w:p>
-    <w:p>
-      <w:pPr>
-        <w:spacing w:after="160"/>
-        <w:jc w:val="left"/>
-      </w:pPr>
-      <w:r>
-        <w:rPr>
-          <w:rFonts w:ascii="Helvetica" w:cs="Helvetica" w:eastAsia="Helvetica" w:hAnsi="Helvetica"/>
-          <w:i/>
-          <w:iCs/>
-          <w:sz w:val="20"/>
-          <w:szCs w:val="20"/>
-        </w:rPr>
-        <w:t xml:space="preserve">Notes: Heavy lattice geometry belongs in visualGeo, never in geo: simulate the homogenized envelope, display the lattice.</w:t>
-      </w:r>
-    </w:p>
     <w:p>
       <w:r>
         <w:br w:type="page"/>

</xml_diff>

<commit_message>
License: MIT -> LGPL-2.1-or-later (full canonical text); README + manual updated
</commit_message>
<xml_diff>
--- a/docs/manual/Cushion_Manual.docx
+++ b/docs/manual/Cushion_Manual.docx
@@ -284,7 +284,7 @@
           <w:sz w:val="20"/>
           <w:szCs w:val="20"/>
         </w:rPr>
-        <w:t xml:space="preserve">License: TO BE DETERMINED before release.</w:t>
+        <w:t xml:space="preserve">Licensed under the GNU Lesser General Public License v2.1 or later.</w:t>
       </w:r>
     </w:p>
     <w:p>
@@ -298,7 +298,7 @@
           <w:sz w:val="20"/>
           <w:szCs w:val="20"/>
         </w:rPr>
-        <w:t xml:space="preserve">[Replace this block with the final license text.]</w:t>
+        <w:t xml:space="preserve">See the LICENSE file in the repository for the full text.</w:t>
       </w:r>
     </w:p>
     <w:p>

</xml_diff>

<commit_message>
docs: add output types/access to manual tables; real repo + contact links; wire toolbar screenshot slot
</commit_message>
<xml_diff>
--- a/docs/manual/Cushion_Manual.docx
+++ b/docs/manual/Cushion_Manual.docx
@@ -288,7 +288,7 @@
           <w:sz w:val="20"/>
           <w:szCs w:val="20"/>
         </w:rPr>
-        <w:t xml:space="preserve">[website]        [contact email]        [repository URL]</w:t>
+        <w:t xml:space="preserve">trevorwexley@gmail.com          github.com/te5msride/cushion</w:t>
       </w:r>
     </w:p>
     <w:p>
@@ -969,7 +969,7 @@
           <w:sz w:val="22"/>
           <w:szCs w:val="22"/>
         </w:rPr>
-        <w:t xml:space="preserve">-  Cushion repository &amp; issues: [repository URL]</w:t>
+        <w:t xml:space="preserve">-  Cushion repository &amp; issues: github.com/te5msride/cushion</w:t>
       </w:r>
     </w:p>
     <w:p>
@@ -982,7 +982,7 @@
           <w:sz w:val="22"/>
           <w:szCs w:val="22"/>
         </w:rPr>
-        <w:t xml:space="preserve">-  Manual, examples, install guides: [repository URL]/docs</w:t>
+        <w:t xml:space="preserve">-  Manual, examples, install guides: github.com/te5msride/cushion/tree/master/docs</w:t>
       </w:r>
     </w:p>
     <w:p>
@@ -1070,7 +1070,7 @@
           <w:sz w:val="22"/>
           <w:szCs w:val="22"/>
         </w:rPr>
-        <w:t xml:space="preserve">[toolbar screenshot placeholder -- replace with a capture of the Cushion tab]</w:t>
+        <w:t xml:space="preserve">[toolbar screenshot placeholder -- add figures/toolbar.png (a crop of the Cushion tab) and rebuild]</w:t>
       </w:r>
     </w:p>
     <w:p>
@@ -4050,7 +4050,7 @@
                 <w:sz w:val="18"/>
                 <w:szCs w:val="18"/>
               </w:rPr>
-              <w:t xml:space="preserve"/>
+              <w:t xml:space="preserve">Type</w:t>
             </w:r>
           </w:p>
         </w:tc>
@@ -4074,7 +4074,7 @@
                 <w:sz w:val="18"/>
                 <w:szCs w:val="18"/>
               </w:rPr>
-              <w:t xml:space="preserve"/>
+              <w:t xml:space="preserve">Access</w:t>
             </w:r>
           </w:p>
         </w:tc>
@@ -4142,7 +4142,7 @@
                 <w:sz w:val="18"/>
                 <w:szCs w:val="18"/>
               </w:rPr>
-              <w:t xml:space="preserve"/>
+              <w:t xml:space="preserve">Body</w:t>
             </w:r>
           </w:p>
         </w:tc>
@@ -4163,7 +4163,7 @@
                 <w:sz w:val="18"/>
                 <w:szCs w:val="18"/>
               </w:rPr>
-              <w:t xml:space="preserve"/>
+              <w:t xml:space="preserve">item</w:t>
             </w:r>
           </w:p>
         </w:tc>
@@ -4184,7 +4184,7 @@
                 <w:sz w:val="18"/>
                 <w:szCs w:val="18"/>
               </w:rPr>
-              <w:t xml:space="preserve">Body reference, feed into SofaScene.</w:t>
+              <w:t xml:space="preserve">Reference, feed into SofaScene.</w:t>
             </w:r>
           </w:p>
         </w:tc>
@@ -4879,7 +4879,7 @@
                 <w:sz w:val="18"/>
                 <w:szCs w:val="18"/>
               </w:rPr>
-              <w:t xml:space="preserve"/>
+              <w:t xml:space="preserve">Type</w:t>
             </w:r>
           </w:p>
         </w:tc>
@@ -4903,7 +4903,7 @@
                 <w:sz w:val="18"/>
                 <w:szCs w:val="18"/>
               </w:rPr>
-              <w:t xml:space="preserve"/>
+              <w:t xml:space="preserve">Access</w:t>
             </w:r>
           </w:p>
         </w:tc>
@@ -4971,7 +4971,7 @@
                 <w:sz w:val="18"/>
                 <w:szCs w:val="18"/>
               </w:rPr>
-              <w:t xml:space="preserve"/>
+              <w:t xml:space="preserve">Cavity</w:t>
             </w:r>
           </w:p>
         </w:tc>
@@ -4992,7 +4992,7 @@
                 <w:sz w:val="18"/>
                 <w:szCs w:val="18"/>
               </w:rPr>
-              <w:t xml:space="preserve"/>
+              <w:t xml:space="preserve">item</w:t>
             </w:r>
           </w:p>
         </w:tc>
@@ -5013,7 +5013,7 @@
                 <w:sz w:val="18"/>
                 <w:szCs w:val="18"/>
               </w:rPr>
-              <w:t xml:space="preserve">Cavity reference, feed into SofaBody.</w:t>
+              <w:t xml:space="preserve">Reference, feed into SofaBody.</w:t>
             </w:r>
           </w:p>
         </w:tc>
@@ -5880,7 +5880,7 @@
                 <w:sz w:val="18"/>
                 <w:szCs w:val="18"/>
               </w:rPr>
-              <w:t xml:space="preserve"/>
+              <w:t xml:space="preserve">Type</w:t>
             </w:r>
           </w:p>
         </w:tc>
@@ -5904,7 +5904,7 @@
                 <w:sz w:val="18"/>
                 <w:szCs w:val="18"/>
               </w:rPr>
-              <w:t xml:space="preserve"/>
+              <w:t xml:space="preserve">Access</w:t>
             </w:r>
           </w:p>
         </w:tc>
@@ -5972,7 +5972,7 @@
                 <w:sz w:val="18"/>
                 <w:szCs w:val="18"/>
               </w:rPr>
-              <w:t xml:space="preserve"/>
+              <w:t xml:space="preserve">Tendon</w:t>
             </w:r>
           </w:p>
         </w:tc>
@@ -5993,7 +5993,7 @@
                 <w:sz w:val="18"/>
                 <w:szCs w:val="18"/>
               </w:rPr>
-              <w:t xml:space="preserve"/>
+              <w:t xml:space="preserve">item</w:t>
             </w:r>
           </w:p>
         </w:tc>
@@ -6014,7 +6014,7 @@
                 <w:sz w:val="18"/>
                 <w:szCs w:val="18"/>
               </w:rPr>
-              <w:t xml:space="preserve">Tendon reference, feed into SofaBody.</w:t>
+              <w:t xml:space="preserve">Reference, feed into SofaBody.</w:t>
             </w:r>
           </w:p>
         </w:tc>
@@ -6058,7 +6058,7 @@
                 <w:sz w:val="18"/>
                 <w:szCs w:val="18"/>
               </w:rPr>
-              <w:t xml:space="preserve"/>
+              <w:t xml:space="preserve">Point</w:t>
             </w:r>
           </w:p>
         </w:tc>
@@ -6079,7 +6079,7 @@
                 <w:sz w:val="18"/>
                 <w:szCs w:val="18"/>
               </w:rPr>
-              <w:t xml:space="preserve"/>
+              <w:t xml:space="preserve">list</w:t>
             </w:r>
           </w:p>
         </w:tc>
@@ -6795,7 +6795,7 @@
                 <w:sz w:val="18"/>
                 <w:szCs w:val="18"/>
               </w:rPr>
-              <w:t xml:space="preserve"/>
+              <w:t xml:space="preserve">Type</w:t>
             </w:r>
           </w:p>
         </w:tc>
@@ -6819,7 +6819,7 @@
                 <w:sz w:val="18"/>
                 <w:szCs w:val="18"/>
               </w:rPr>
-              <w:t xml:space="preserve"/>
+              <w:t xml:space="preserve">Access</w:t>
             </w:r>
           </w:p>
         </w:tc>
@@ -6887,7 +6887,7 @@
                 <w:sz w:val="18"/>
                 <w:szCs w:val="18"/>
               </w:rPr>
-              <w:t xml:space="preserve"/>
+              <w:t xml:space="preserve">Tendon</w:t>
             </w:r>
           </w:p>
         </w:tc>
@@ -6908,7 +6908,7 @@
                 <w:sz w:val="18"/>
                 <w:szCs w:val="18"/>
               </w:rPr>
-              <w:t xml:space="preserve"/>
+              <w:t xml:space="preserve">list</w:t>
             </w:r>
           </w:p>
         </w:tc>
@@ -6929,7 +6929,7 @@
                 <w:sz w:val="18"/>
                 <w:szCs w:val="18"/>
               </w:rPr>
-              <w:t xml:space="preserve">List of tendon references, feed into SofaBody (no Merge needed).</w:t>
+              <w:t xml:space="preserve">References, feed into SofaBody (no Merge needed).</w:t>
             </w:r>
           </w:p>
         </w:tc>
@@ -6973,7 +6973,7 @@
                 <w:sz w:val="18"/>
                 <w:szCs w:val="18"/>
               </w:rPr>
-              <w:t xml:space="preserve"/>
+              <w:t xml:space="preserve">Text</w:t>
             </w:r>
           </w:p>
         </w:tc>
@@ -6994,7 +6994,7 @@
                 <w:sz w:val="18"/>
                 <w:szCs w:val="18"/>
               </w:rPr>
-              <w:t xml:space="preserve"/>
+              <w:t xml:space="preserve">item</w:t>
             </w:r>
           </w:p>
         </w:tc>
@@ -8024,7 +8024,7 @@
                 <w:sz w:val="18"/>
                 <w:szCs w:val="18"/>
               </w:rPr>
-              <w:t xml:space="preserve"/>
+              <w:t xml:space="preserve">Type</w:t>
             </w:r>
           </w:p>
         </w:tc>
@@ -8048,7 +8048,7 @@
                 <w:sz w:val="18"/>
                 <w:szCs w:val="18"/>
               </w:rPr>
-              <w:t xml:space="preserve"/>
+              <w:t xml:space="preserve">Access</w:t>
             </w:r>
           </w:p>
         </w:tc>
@@ -8116,7 +8116,7 @@
                 <w:sz w:val="18"/>
                 <w:szCs w:val="18"/>
               </w:rPr>
-              <w:t xml:space="preserve"/>
+              <w:t xml:space="preserve">Region</w:t>
             </w:r>
           </w:p>
         </w:tc>
@@ -8137,7 +8137,7 @@
                 <w:sz w:val="18"/>
                 <w:szCs w:val="18"/>
               </w:rPr>
-              <w:t xml:space="preserve"/>
+              <w:t xml:space="preserve">item</w:t>
             </w:r>
           </w:p>
         </w:tc>
@@ -8158,7 +8158,7 @@
                 <w:sz w:val="18"/>
                 <w:szCs w:val="18"/>
               </w:rPr>
-              <w:t xml:space="preserve">Region reference, feed into SofaBody.</w:t>
+              <w:t xml:space="preserve">Reference, feed into SofaBody.</w:t>
             </w:r>
           </w:p>
         </w:tc>
@@ -8202,7 +8202,7 @@
                 <w:sz w:val="18"/>
                 <w:szCs w:val="18"/>
               </w:rPr>
-              <w:t xml:space="preserve"/>
+              <w:t xml:space="preserve">Mesh</w:t>
             </w:r>
           </w:p>
         </w:tc>
@@ -8223,7 +8223,7 @@
                 <w:sz w:val="18"/>
                 <w:szCs w:val="18"/>
               </w:rPr>
-              <w:t xml:space="preserve"/>
+              <w:t xml:space="preserve">item</w:t>
             </w:r>
           </w:p>
         </w:tc>
@@ -8909,7 +8909,7 @@
                 <w:sz w:val="18"/>
                 <w:szCs w:val="18"/>
               </w:rPr>
-              <w:t xml:space="preserve"/>
+              <w:t xml:space="preserve">Type</w:t>
             </w:r>
           </w:p>
         </w:tc>
@@ -8933,7 +8933,7 @@
                 <w:sz w:val="18"/>
                 <w:szCs w:val="18"/>
               </w:rPr>
-              <w:t xml:space="preserve"/>
+              <w:t xml:space="preserve">Access</w:t>
             </w:r>
           </w:p>
         </w:tc>
@@ -9001,7 +9001,7 @@
                 <w:sz w:val="18"/>
                 <w:szCs w:val="18"/>
               </w:rPr>
-              <w:t xml:space="preserve"/>
+              <w:t xml:space="preserve">Target</w:t>
             </w:r>
           </w:p>
         </w:tc>
@@ -9022,7 +9022,7 @@
                 <w:sz w:val="18"/>
                 <w:szCs w:val="18"/>
               </w:rPr>
-              <w:t xml:space="preserve"/>
+              <w:t xml:space="preserve">item</w:t>
             </w:r>
           </w:p>
         </w:tc>
@@ -9043,7 +9043,7 @@
                 <w:sz w:val="18"/>
                 <w:szCs w:val="18"/>
               </w:rPr>
-              <w:t xml:space="preserve">Target reference, feed into SofaScene.</w:t>
+              <w:t xml:space="preserve">Reference, feed into SofaScene.</w:t>
             </w:r>
           </w:p>
         </w:tc>
@@ -9652,7 +9652,7 @@
                 <w:sz w:val="18"/>
                 <w:szCs w:val="18"/>
               </w:rPr>
-              <w:t xml:space="preserve"/>
+              <w:t xml:space="preserve">Type</w:t>
             </w:r>
           </w:p>
         </w:tc>
@@ -9676,7 +9676,7 @@
                 <w:sz w:val="18"/>
                 <w:szCs w:val="18"/>
               </w:rPr>
-              <w:t xml:space="preserve"/>
+              <w:t xml:space="preserve">Access</w:t>
             </w:r>
           </w:p>
         </w:tc>
@@ -9744,7 +9744,7 @@
                 <w:sz w:val="18"/>
                 <w:szCs w:val="18"/>
               </w:rPr>
-              <w:t xml:space="preserve"/>
+              <w:t xml:space="preserve">Profile</w:t>
             </w:r>
           </w:p>
         </w:tc>
@@ -9765,7 +9765,7 @@
                 <w:sz w:val="18"/>
                 <w:szCs w:val="18"/>
               </w:rPr>
-              <w:t xml:space="preserve"/>
+              <w:t xml:space="preserve">item</w:t>
             </w:r>
           </w:p>
         </w:tc>
@@ -9786,7 +9786,7 @@
                 <w:sz w:val="18"/>
                 <w:szCs w:val="18"/>
               </w:rPr>
-              <w:t xml:space="preserve">Profile reference, feed into SofaScene.</w:t>
+              <w:t xml:space="preserve">Reference, feed into SofaScene.</w:t>
             </w:r>
           </w:p>
         </w:tc>
@@ -10395,7 +10395,7 @@
                 <w:sz w:val="18"/>
                 <w:szCs w:val="18"/>
               </w:rPr>
-              <w:t xml:space="preserve"/>
+              <w:t xml:space="preserve">Type</w:t>
             </w:r>
           </w:p>
         </w:tc>
@@ -10419,7 +10419,7 @@
                 <w:sz w:val="18"/>
                 <w:szCs w:val="18"/>
               </w:rPr>
-              <w:t xml:space="preserve"/>
+              <w:t xml:space="preserve">Access</w:t>
             </w:r>
           </w:p>
         </w:tc>
@@ -10487,7 +10487,7 @@
                 <w:sz w:val="18"/>
                 <w:szCs w:val="18"/>
               </w:rPr>
-              <w:t xml:space="preserve"/>
+              <w:t xml:space="preserve">Profile</w:t>
             </w:r>
           </w:p>
         </w:tc>
@@ -10508,7 +10508,7 @@
                 <w:sz w:val="18"/>
                 <w:szCs w:val="18"/>
               </w:rPr>
-              <w:t xml:space="preserve"/>
+              <w:t xml:space="preserve">list</w:t>
             </w:r>
           </w:p>
         </w:tc>
@@ -10529,7 +10529,7 @@
                 <w:sz w:val="18"/>
                 <w:szCs w:val="18"/>
               </w:rPr>
-              <w:t xml:space="preserve">List of profile references, feed into SofaScene.</w:t>
+              <w:t xml:space="preserve">References, feed into SofaScene.</w:t>
             </w:r>
           </w:p>
         </w:tc>
@@ -10573,7 +10573,7 @@
                 <w:sz w:val="18"/>
                 <w:szCs w:val="18"/>
               </w:rPr>
-              <w:t xml:space="preserve"/>
+              <w:t xml:space="preserve">Text</w:t>
             </w:r>
           </w:p>
         </w:tc>
@@ -10594,7 +10594,7 @@
                 <w:sz w:val="18"/>
                 <w:szCs w:val="18"/>
               </w:rPr>
-              <w:t xml:space="preserve"/>
+              <w:t xml:space="preserve">item</w:t>
             </w:r>
           </w:p>
         </w:tc>
@@ -11194,7 +11194,7 @@
                 <w:sz w:val="18"/>
                 <w:szCs w:val="18"/>
               </w:rPr>
-              <w:t xml:space="preserve"/>
+              <w:t xml:space="preserve">Type</w:t>
             </w:r>
           </w:p>
         </w:tc>
@@ -11218,7 +11218,7 @@
                 <w:sz w:val="18"/>
                 <w:szCs w:val="18"/>
               </w:rPr>
-              <w:t xml:space="preserve"/>
+              <w:t xml:space="preserve">Access</w:t>
             </w:r>
           </w:p>
         </w:tc>
@@ -11286,7 +11286,7 @@
                 <w:sz w:val="18"/>
                 <w:szCs w:val="18"/>
               </w:rPr>
-              <w:t xml:space="preserve"/>
+              <w:t xml:space="preserve">Protocol</w:t>
             </w:r>
           </w:p>
         </w:tc>
@@ -11307,7 +11307,7 @@
                 <w:sz w:val="18"/>
                 <w:szCs w:val="18"/>
               </w:rPr>
-              <w:t xml:space="preserve"/>
+              <w:t xml:space="preserve">item</w:t>
             </w:r>
           </w:p>
         </w:tc>
@@ -11328,7 +11328,7 @@
                 <w:sz w:val="18"/>
                 <w:szCs w:val="18"/>
               </w:rPr>
-              <w:t xml:space="preserve">Protocol reference, feed into SofaBody.</w:t>
+              <w:t xml:space="preserve">Reference, feed into SofaBody.</w:t>
             </w:r>
           </w:p>
         </w:tc>
@@ -12883,7 +12883,7 @@
                 <w:sz w:val="18"/>
                 <w:szCs w:val="18"/>
               </w:rPr>
-              <w:t xml:space="preserve"/>
+              <w:t xml:space="preserve">Type</w:t>
             </w:r>
           </w:p>
         </w:tc>
@@ -12907,7 +12907,7 @@
                 <w:sz w:val="18"/>
                 <w:szCs w:val="18"/>
               </w:rPr>
-              <w:t xml:space="preserve"/>
+              <w:t xml:space="preserve">Access</w:t>
             </w:r>
           </w:p>
         </w:tc>
@@ -12975,7 +12975,7 @@
                 <w:sz w:val="18"/>
                 <w:szCs w:val="18"/>
               </w:rPr>
-              <w:t xml:space="preserve"/>
+              <w:t xml:space="preserve">Text</w:t>
             </w:r>
           </w:p>
         </w:tc>
@@ -12996,7 +12996,7 @@
                 <w:sz w:val="18"/>
                 <w:szCs w:val="18"/>
               </w:rPr>
-              <w:t xml:space="preserve"/>
+              <w:t xml:space="preserve">item</w:t>
             </w:r>
           </w:p>
         </w:tc>
@@ -13061,7 +13061,7 @@
                 <w:sz w:val="18"/>
                 <w:szCs w:val="18"/>
               </w:rPr>
-              <w:t xml:space="preserve"/>
+              <w:t xml:space="preserve">Text</w:t>
             </w:r>
           </w:p>
         </w:tc>
@@ -13082,7 +13082,7 @@
                 <w:sz w:val="18"/>
                 <w:szCs w:val="18"/>
               </w:rPr>
-              <w:t xml:space="preserve"/>
+              <w:t xml:space="preserve">item</w:t>
             </w:r>
           </w:p>
         </w:tc>
@@ -13970,7 +13970,7 @@
                 <w:sz w:val="18"/>
                 <w:szCs w:val="18"/>
               </w:rPr>
-              <w:t xml:space="preserve"/>
+              <w:t xml:space="preserve">Type</w:t>
             </w:r>
           </w:p>
         </w:tc>
@@ -13994,7 +13994,7 @@
                 <w:sz w:val="18"/>
                 <w:szCs w:val="18"/>
               </w:rPr>
-              <w:t xml:space="preserve"/>
+              <w:t xml:space="preserve">Access</w:t>
             </w:r>
           </w:p>
         </w:tc>
@@ -14062,7 +14062,7 @@
                 <w:sz w:val="18"/>
                 <w:szCs w:val="18"/>
               </w:rPr>
-              <w:t xml:space="preserve"/>
+              <w:t xml:space="preserve">Text</w:t>
             </w:r>
           </w:p>
         </w:tc>
@@ -14083,7 +14083,7 @@
                 <w:sz w:val="18"/>
                 <w:szCs w:val="18"/>
               </w:rPr>
-              <w:t xml:space="preserve"/>
+              <w:t xml:space="preserve">item</w:t>
             </w:r>
           </w:p>
         </w:tc>
@@ -14683,7 +14683,7 @@
                 <w:sz w:val="18"/>
                 <w:szCs w:val="18"/>
               </w:rPr>
-              <w:t xml:space="preserve"/>
+              <w:t xml:space="preserve">Type</w:t>
             </w:r>
           </w:p>
         </w:tc>
@@ -14707,7 +14707,7 @@
                 <w:sz w:val="18"/>
                 <w:szCs w:val="18"/>
               </w:rPr>
-              <w:t xml:space="preserve"/>
+              <w:t xml:space="preserve">Access</w:t>
             </w:r>
           </w:p>
         </w:tc>
@@ -14775,7 +14775,7 @@
                 <w:sz w:val="18"/>
                 <w:szCs w:val="18"/>
               </w:rPr>
-              <w:t xml:space="preserve"/>
+              <w:t xml:space="preserve">Mesh</w:t>
             </w:r>
           </w:p>
         </w:tc>
@@ -14796,7 +14796,7 @@
                 <w:sz w:val="18"/>
                 <w:szCs w:val="18"/>
               </w:rPr>
-              <w:t xml:space="preserve"/>
+              <w:t xml:space="preserve">list</w:t>
             </w:r>
           </w:p>
         </w:tc>
@@ -14861,7 +14861,7 @@
                 <w:sz w:val="18"/>
                 <w:szCs w:val="18"/>
               </w:rPr>
-              <w:t xml:space="preserve"/>
+              <w:t xml:space="preserve">Mesh</w:t>
             </w:r>
           </w:p>
         </w:tc>
@@ -14882,7 +14882,7 @@
                 <w:sz w:val="18"/>
                 <w:szCs w:val="18"/>
               </w:rPr>
-              <w:t xml:space="preserve"/>
+              <w:t xml:space="preserve">list</w:t>
             </w:r>
           </w:p>
         </w:tc>
@@ -14947,7 +14947,7 @@
                 <w:sz w:val="18"/>
                 <w:szCs w:val="18"/>
               </w:rPr>
-              <w:t xml:space="preserve"/>
+              <w:t xml:space="preserve">Mesh</w:t>
             </w:r>
           </w:p>
         </w:tc>
@@ -14968,7 +14968,7 @@
                 <w:sz w:val="18"/>
                 <w:szCs w:val="18"/>
               </w:rPr>
-              <w:t xml:space="preserve"/>
+              <w:t xml:space="preserve">list</w:t>
             </w:r>
           </w:p>
         </w:tc>
@@ -15033,7 +15033,7 @@
                 <w:sz w:val="18"/>
                 <w:szCs w:val="18"/>
               </w:rPr>
-              <w:t xml:space="preserve"/>
+              <w:t xml:space="preserve">Mesh</w:t>
             </w:r>
           </w:p>
         </w:tc>
@@ -15054,7 +15054,7 @@
                 <w:sz w:val="18"/>
                 <w:szCs w:val="18"/>
               </w:rPr>
-              <w:t xml:space="preserve"/>
+              <w:t xml:space="preserve">list</w:t>
             </w:r>
           </w:p>
         </w:tc>
@@ -15119,7 +15119,7 @@
                 <w:sz w:val="18"/>
                 <w:szCs w:val="18"/>
               </w:rPr>
-              <w:t xml:space="preserve"/>
+              <w:t xml:space="preserve">Curve</w:t>
             </w:r>
           </w:p>
         </w:tc>
@@ -15140,7 +15140,7 @@
                 <w:sz w:val="18"/>
                 <w:szCs w:val="18"/>
               </w:rPr>
-              <w:t xml:space="preserve"/>
+              <w:t xml:space="preserve">list</w:t>
             </w:r>
           </w:p>
         </w:tc>
@@ -15205,7 +15205,7 @@
                 <w:sz w:val="18"/>
                 <w:szCs w:val="18"/>
               </w:rPr>
-              <w:t xml:space="preserve"/>
+              <w:t xml:space="preserve">Integer</w:t>
             </w:r>
           </w:p>
         </w:tc>
@@ -15226,7 +15226,7 @@
                 <w:sz w:val="18"/>
                 <w:szCs w:val="18"/>
               </w:rPr>
-              <w:t xml:space="preserve"/>
+              <w:t xml:space="preserve">list</w:t>
             </w:r>
           </w:p>
         </w:tc>
@@ -15291,7 +15291,7 @@
                 <w:sz w:val="18"/>
                 <w:szCs w:val="18"/>
               </w:rPr>
-              <w:t xml:space="preserve"/>
+              <w:t xml:space="preserve">Point</w:t>
             </w:r>
           </w:p>
         </w:tc>
@@ -15312,7 +15312,7 @@
                 <w:sz w:val="18"/>
                 <w:szCs w:val="18"/>
               </w:rPr>
-              <w:t xml:space="preserve"/>
+              <w:t xml:space="preserve">list</w:t>
             </w:r>
           </w:p>
         </w:tc>
@@ -15377,7 +15377,7 @@
                 <w:sz w:val="18"/>
                 <w:szCs w:val="18"/>
               </w:rPr>
-              <w:t xml:space="preserve"/>
+              <w:t xml:space="preserve">Box</w:t>
             </w:r>
           </w:p>
         </w:tc>
@@ -15398,7 +15398,7 @@
                 <w:sz w:val="18"/>
                 <w:szCs w:val="18"/>
               </w:rPr>
-              <w:t xml:space="preserve"/>
+              <w:t xml:space="preserve">list</w:t>
             </w:r>
           </w:p>
         </w:tc>
@@ -15463,7 +15463,7 @@
                 <w:sz w:val="18"/>
                 <w:szCs w:val="18"/>
               </w:rPr>
-              <w:t xml:space="preserve"/>
+              <w:t xml:space="preserve">Text</w:t>
             </w:r>
           </w:p>
         </w:tc>
@@ -15484,7 +15484,7 @@
                 <w:sz w:val="18"/>
                 <w:szCs w:val="18"/>
               </w:rPr>
-              <w:t xml:space="preserve"/>
+              <w:t xml:space="preserve">item</w:t>
             </w:r>
           </w:p>
         </w:tc>
@@ -16170,7 +16170,7 @@
                 <w:sz w:val="18"/>
                 <w:szCs w:val="18"/>
               </w:rPr>
-              <w:t xml:space="preserve"/>
+              <w:t xml:space="preserve">Type</w:t>
             </w:r>
           </w:p>
         </w:tc>
@@ -16194,7 +16194,7 @@
                 <w:sz w:val="18"/>
                 <w:szCs w:val="18"/>
               </w:rPr>
-              <w:t xml:space="preserve"/>
+              <w:t xml:space="preserve">Access</w:t>
             </w:r>
           </w:p>
         </w:tc>
@@ -16262,7 +16262,7 @@
                 <w:sz w:val="18"/>
                 <w:szCs w:val="18"/>
               </w:rPr>
-              <w:t xml:space="preserve"/>
+              <w:t xml:space="preserve">Text</w:t>
             </w:r>
           </w:p>
         </w:tc>
@@ -16283,7 +16283,7 @@
                 <w:sz w:val="18"/>
                 <w:szCs w:val="18"/>
               </w:rPr>
-              <w:t xml:space="preserve"/>
+              <w:t xml:space="preserve">item</w:t>
             </w:r>
           </w:p>
         </w:tc>
@@ -16348,7 +16348,7 @@
                 <w:sz w:val="18"/>
                 <w:szCs w:val="18"/>
               </w:rPr>
-              <w:t xml:space="preserve"/>
+              <w:t xml:space="preserve">Number</w:t>
             </w:r>
           </w:p>
         </w:tc>
@@ -16369,7 +16369,7 @@
                 <w:sz w:val="18"/>
                 <w:szCs w:val="18"/>
               </w:rPr>
-              <w:t xml:space="preserve"/>
+              <w:t xml:space="preserve">list</w:t>
             </w:r>
           </w:p>
         </w:tc>
@@ -16434,7 +16434,7 @@
                 <w:sz w:val="18"/>
                 <w:szCs w:val="18"/>
               </w:rPr>
-              <w:t xml:space="preserve"/>
+              <w:t xml:space="preserve">Point</w:t>
             </w:r>
           </w:p>
         </w:tc>
@@ -16455,7 +16455,7 @@
                 <w:sz w:val="18"/>
                 <w:szCs w:val="18"/>
               </w:rPr>
-              <w:t xml:space="preserve"/>
+              <w:t xml:space="preserve">tree</w:t>
             </w:r>
           </w:p>
         </w:tc>
@@ -16476,7 +16476,7 @@
                 <w:sz w:val="18"/>
                 <w:szCs w:val="18"/>
               </w:rPr>
-              <w:t xml:space="preserve">Tree: branch per frame, items = tracked point positions.</w:t>
+              <w:t xml:space="preserve">Branch per frame, items = tracked point positions.</w:t>
             </w:r>
           </w:p>
         </w:tc>
@@ -16520,7 +16520,7 @@
                 <w:sz w:val="18"/>
                 <w:szCs w:val="18"/>
               </w:rPr>
-              <w:t xml:space="preserve"/>
+              <w:t xml:space="preserve">Point</w:t>
             </w:r>
           </w:p>
         </w:tc>
@@ -16541,7 +16541,7 @@
                 <w:sz w:val="18"/>
                 <w:szCs w:val="18"/>
               </w:rPr>
-              <w:t xml:space="preserve"/>
+              <w:t xml:space="preserve">list</w:t>
             </w:r>
           </w:p>
         </w:tc>
@@ -16606,7 +16606,7 @@
                 <w:sz w:val="18"/>
                 <w:szCs w:val="18"/>
               </w:rPr>
-              <w:t xml:space="preserve"/>
+              <w:t xml:space="preserve">Vector</w:t>
             </w:r>
           </w:p>
         </w:tc>
@@ -16627,7 +16627,7 @@
                 <w:sz w:val="18"/>
                 <w:szCs w:val="18"/>
               </w:rPr>
-              <w:t xml:space="preserve"/>
+              <w:t xml:space="preserve">tree</w:t>
             </w:r>
           </w:p>
         </w:tc>
@@ -16648,7 +16648,7 @@
                 <w:sz w:val="18"/>
                 <w:szCs w:val="18"/>
               </w:rPr>
-              <w:t xml:space="preserve">Tree of vectors: nodal force (mN) at the monitor points, branch per frame -- the grip reaction where a point sits on a contact pad.</w:t>
+              <w:t xml:space="preserve">Nodal force (mN) at the monitor points, branch per frame -- the grip reaction where a point sits on a contact pad.</w:t>
             </w:r>
           </w:p>
         </w:tc>
@@ -16692,7 +16692,7 @@
                 <w:sz w:val="18"/>
                 <w:szCs w:val="18"/>
               </w:rPr>
-              <w:t xml:space="preserve"/>
+              <w:t xml:space="preserve">Number</w:t>
             </w:r>
           </w:p>
         </w:tc>
@@ -16713,7 +16713,7 @@
                 <w:sz w:val="18"/>
                 <w:szCs w:val="18"/>
               </w:rPr>
-              <w:t xml:space="preserve"/>
+              <w:t xml:space="preserve">list</w:t>
             </w:r>
           </w:p>
         </w:tc>
@@ -16778,7 +16778,7 @@
                 <w:sz w:val="18"/>
                 <w:szCs w:val="18"/>
               </w:rPr>
-              <w:t xml:space="preserve"/>
+              <w:t xml:space="preserve">Number</w:t>
             </w:r>
           </w:p>
         </w:tc>
@@ -16799,7 +16799,7 @@
                 <w:sz w:val="18"/>
                 <w:szCs w:val="18"/>
               </w:rPr>
-              <w:t xml:space="preserve"/>
+              <w:t xml:space="preserve">tree</w:t>
             </w:r>
           </w:p>
         </w:tc>
@@ -16820,7 +16820,7 @@
                 <w:sz w:val="18"/>
                 <w:szCs w:val="18"/>
               </w:rPr>
-              <w:t xml:space="preserve">Tree: branch per channel, commanded/measured values.</w:t>
+              <w:t xml:space="preserve">Branch per channel, commanded/measured values.</w:t>
             </w:r>
           </w:p>
         </w:tc>
@@ -16864,7 +16864,7 @@
                 <w:sz w:val="18"/>
                 <w:szCs w:val="18"/>
               </w:rPr>
-              <w:t xml:space="preserve"/>
+              <w:t xml:space="preserve">Text</w:t>
             </w:r>
           </w:p>
         </w:tc>
@@ -16885,7 +16885,7 @@
                 <w:sz w:val="18"/>
                 <w:szCs w:val="18"/>
               </w:rPr>
-              <w:t xml:space="preserve"/>
+              <w:t xml:space="preserve">list</w:t>
             </w:r>
           </w:p>
         </w:tc>
@@ -16950,7 +16950,7 @@
                 <w:sz w:val="18"/>
                 <w:szCs w:val="18"/>
               </w:rPr>
-              <w:t xml:space="preserve"/>
+              <w:t xml:space="preserve">Number</w:t>
             </w:r>
           </w:p>
         </w:tc>
@@ -16971,7 +16971,7 @@
                 <w:sz w:val="18"/>
                 <w:szCs w:val="18"/>
               </w:rPr>
-              <w:t xml:space="preserve"/>
+              <w:t xml:space="preserve">tree</w:t>
             </w:r>
           </w:p>
         </w:tc>
@@ -16992,7 +16992,7 @@
                 <w:sz w:val="18"/>
                 <w:szCs w:val="18"/>
               </w:rPr>
-              <w:t xml:space="preserve">Tree: displacement per cable, mm.</w:t>
+              <w:t xml:space="preserve">Displacement per cable, mm.</w:t>
             </w:r>
           </w:p>
         </w:tc>
@@ -17036,7 +17036,7 @@
                 <w:sz w:val="18"/>
                 <w:szCs w:val="18"/>
               </w:rPr>
-              <w:t xml:space="preserve"/>
+              <w:t xml:space="preserve">Number</w:t>
             </w:r>
           </w:p>
         </w:tc>
@@ -17057,7 +17057,7 @@
                 <w:sz w:val="18"/>
                 <w:szCs w:val="18"/>
               </w:rPr>
-              <w:t xml:space="preserve"/>
+              <w:t xml:space="preserve">tree</w:t>
             </w:r>
           </w:p>
         </w:tc>
@@ -17078,7 +17078,7 @@
                 <w:sz w:val="18"/>
                 <w:szCs w:val="18"/>
               </w:rPr>
-              <w:t xml:space="preserve">Tree: force per cable, mN.</w:t>
+              <w:t xml:space="preserve">Force per cable, mN.</w:t>
             </w:r>
           </w:p>
         </w:tc>
@@ -17122,7 +17122,7 @@
                 <w:sz w:val="18"/>
                 <w:szCs w:val="18"/>
               </w:rPr>
-              <w:t xml:space="preserve"/>
+              <w:t xml:space="preserve">Text</w:t>
             </w:r>
           </w:p>
         </w:tc>
@@ -17143,7 +17143,7 @@
                 <w:sz w:val="18"/>
                 <w:szCs w:val="18"/>
               </w:rPr>
-              <w:t xml:space="preserve"/>
+              <w:t xml:space="preserve">list</w:t>
             </w:r>
           </w:p>
         </w:tc>
@@ -17208,7 +17208,7 @@
                 <w:sz w:val="18"/>
                 <w:szCs w:val="18"/>
               </w:rPr>
-              <w:t xml:space="preserve"/>
+              <w:t xml:space="preserve">Integer</w:t>
             </w:r>
           </w:p>
         </w:tc>
@@ -17229,7 +17229,7 @@
                 <w:sz w:val="18"/>
                 <w:szCs w:val="18"/>
               </w:rPr>
-              <w:t xml:space="preserve"/>
+              <w:t xml:space="preserve">tree</w:t>
             </w:r>
           </w:p>
         </w:tc>
@@ -17250,7 +17250,7 @@
                 <w:sz w:val="18"/>
                 <w:szCs w:val="18"/>
               </w:rPr>
-              <w:t xml:space="preserve">Tree: number of contacts per step, branch per pair.</w:t>
+              <w:t xml:space="preserve">Number of contacts per step, branch per pair.</w:t>
             </w:r>
           </w:p>
         </w:tc>
@@ -17294,7 +17294,7 @@
                 <w:sz w:val="18"/>
                 <w:szCs w:val="18"/>
               </w:rPr>
-              <w:t xml:space="preserve"/>
+              <w:t xml:space="preserve">Number</w:t>
             </w:r>
           </w:p>
         </w:tc>
@@ -17315,7 +17315,7 @@
                 <w:sz w:val="18"/>
                 <w:szCs w:val="18"/>
               </w:rPr>
-              <w:t xml:space="preserve"/>
+              <w:t xml:space="preserve">tree</w:t>
             </w:r>
           </w:p>
         </w:tc>
@@ -17336,7 +17336,7 @@
                 <w:sz w:val="18"/>
                 <w:szCs w:val="18"/>
               </w:rPr>
-              <w:t xml:space="preserve">Tree: step times, branch per pair.</w:t>
+              <w:t xml:space="preserve">Step times, branch per pair.</w:t>
             </w:r>
           </w:p>
         </w:tc>
@@ -17380,7 +17380,7 @@
                 <w:sz w:val="18"/>
                 <w:szCs w:val="18"/>
               </w:rPr>
-              <w:t xml:space="preserve"/>
+              <w:t xml:space="preserve">Point</w:t>
             </w:r>
           </w:p>
         </w:tc>
@@ -17401,7 +17401,7 @@
                 <w:sz w:val="18"/>
                 <w:szCs w:val="18"/>
               </w:rPr>
-              <w:t xml:space="preserve"/>
+              <w:t xml:space="preserve">tree</w:t>
             </w:r>
           </w:p>
         </w:tc>
@@ -17422,7 +17422,7 @@
                 <w:sz w:val="18"/>
                 <w:szCs w:val="18"/>
               </w:rPr>
-              <w:t xml:space="preserve">Tree: contact locations on the body surface, branch per pair and frame (contact geometry, not force).</w:t>
+              <w:t xml:space="preserve">Contact locations on the body surface, branch per pair and frame (contact geometry, not force).</w:t>
             </w:r>
           </w:p>
         </w:tc>
@@ -18203,7 +18203,7 @@
                 <w:sz w:val="18"/>
                 <w:szCs w:val="18"/>
               </w:rPr>
-              <w:t xml:space="preserve"/>
+              <w:t xml:space="preserve">Type</w:t>
             </w:r>
           </w:p>
         </w:tc>
@@ -18227,7 +18227,7 @@
                 <w:sz w:val="18"/>
                 <w:szCs w:val="18"/>
               </w:rPr>
-              <w:t xml:space="preserve"/>
+              <w:t xml:space="preserve">Access</w:t>
             </w:r>
           </w:p>
         </w:tc>
@@ -18295,7 +18295,7 @@
                 <w:sz w:val="18"/>
                 <w:szCs w:val="18"/>
               </w:rPr>
-              <w:t xml:space="preserve"/>
+              <w:t xml:space="preserve">Mesh</w:t>
             </w:r>
           </w:p>
         </w:tc>
@@ -18316,7 +18316,7 @@
                 <w:sz w:val="18"/>
                 <w:szCs w:val="18"/>
               </w:rPr>
-              <w:t xml:space="preserve"/>
+              <w:t xml:space="preserve">item</w:t>
             </w:r>
           </w:p>
         </w:tc>
@@ -18381,7 +18381,7 @@
                 <w:sz w:val="18"/>
                 <w:szCs w:val="18"/>
               </w:rPr>
-              <w:t xml:space="preserve"/>
+              <w:t xml:space="preserve">Integer</w:t>
             </w:r>
           </w:p>
         </w:tc>
@@ -18402,7 +18402,7 @@
                 <w:sz w:val="18"/>
                 <w:szCs w:val="18"/>
               </w:rPr>
-              <w:t xml:space="preserve"/>
+              <w:t xml:space="preserve">item</w:t>
             </w:r>
           </w:p>
         </w:tc>
@@ -18467,7 +18467,7 @@
                 <w:sz w:val="18"/>
                 <w:szCs w:val="18"/>
               </w:rPr>
-              <w:t xml:space="preserve"/>
+              <w:t xml:space="preserve">Number</w:t>
             </w:r>
           </w:p>
         </w:tc>
@@ -18488,7 +18488,7 @@
                 <w:sz w:val="18"/>
                 <w:szCs w:val="18"/>
               </w:rPr>
-              <w:t xml:space="preserve"/>
+              <w:t xml:space="preserve">item</w:t>
             </w:r>
           </w:p>
         </w:tc>
@@ -18553,7 +18553,7 @@
                 <w:sz w:val="18"/>
                 <w:szCs w:val="18"/>
               </w:rPr>
-              <w:t xml:space="preserve"/>
+              <w:t xml:space="preserve">Text</w:t>
             </w:r>
           </w:p>
         </w:tc>
@@ -18574,7 +18574,7 @@
                 <w:sz w:val="18"/>
                 <w:szCs w:val="18"/>
               </w:rPr>
-              <w:t xml:space="preserve"/>
+              <w:t xml:space="preserve">item</w:t>
             </w:r>
           </w:p>
         </w:tc>

</xml_diff>

<commit_message>
docs: remove em-dashes across README, docs, examples, and manual; fix resulting comma-splices
</commit_message>
<xml_diff>
--- a/docs/manual/Cushion_Manual.docx
+++ b/docs/manual/Cushion_Manual.docx
@@ -218,7 +218,7 @@
           <w:sz w:val="20"/>
           <w:szCs w:val="20"/>
         </w:rPr>
-        <w:t xml:space="preserve">CUSHION V0.1 -- Soft robotics simulation tools for Grasshopper3D</w:t>
+        <w:t xml:space="preserve">CUSHION V0.1: Soft robotics simulation tools for Grasshopper3D</w:t>
       </w:r>
     </w:p>
     <w:p>
@@ -282,7 +282,7 @@
         <w:spacing w:after="60"/>
         <w:jc w:val="center"/>
       </w:pPr>
-      <w:hyperlink w:history="1" r:id="rId6zbeggtyzat4zstpi7ow2">
+      <w:hyperlink w:history="1" r:id="rIdtu_mdnsqcd3p91h4gbftv">
         <w:r>
           <w:rPr>
             <w:rFonts w:ascii="Helvetica" w:cs="Helvetica" w:eastAsia="Helvetica" w:hAnsi="Helvetica"/>
@@ -302,7 +302,7 @@
         </w:rPr>
         <w:t xml:space="preserve">          </w:t>
       </w:r>
-      <w:hyperlink w:history="1" r:id="rIdmkuuqmnviihjdmrrkn0un">
+      <w:hyperlink w:history="1" r:id="rIdw3hormnu7v-jjwrpvv580">
         <w:r>
           <w:rPr>
             <w:rFonts w:ascii="Helvetica" w:cs="Helvetica" w:eastAsia="Helvetica" w:hAnsi="Helvetica"/>
@@ -794,7 +794,7 @@
           <w:sz w:val="22"/>
           <w:szCs w:val="22"/>
         </w:rPr>
-        <w:t xml:space="preserve">Cushion is a plugin for simulating soft robots directly within Rhino and Grasshopper3D. It connects the parametric design environment to SOFA (Simulation Open Framework Architecture) and its SoftRobots plugin: deformable bodies, pneumatic cavities, tendons, stiffened regions, and rigid interaction objects are defined as native Grasshopper components. Cushion meshes the geometry, writes a complete finite-element scene, launches the simulation, and returns trajectories, actuation forces, and deformed shapes to the canvas -- so design iteration and physical simulation live in the same definition.</w:t>
+        <w:t xml:space="preserve">Cushion is a plugin for simulating soft robots directly within Rhino and Grasshopper3D. It connects the parametric design environment to SOFA (Simulation Open Framework Architecture) and its SoftRobots plugin: deformable bodies, pneumatic cavities, tendons, stiffened regions, and rigid interaction objects are defined as native Grasshopper components. Cushion meshes the geometry, writes a complete finite-element scene, launches the simulation, and returns trajectories, actuation forces, and deformed shapes to the canvas, so design iteration and physical simulation live in the same definition.</w:t>
       </w:r>
     </w:p>
     <w:p>
@@ -808,7 +808,7 @@
           <w:sz w:val="22"/>
           <w:szCs w:val="22"/>
         </w:rPr>
-        <w:t xml:space="preserve">The workflow grew out of the Monolithic Unit research pipeline (Exley, Nardin, Trunin, Cafiso and Beccai, 2025), in which soft pneumatic actuators designed parametrically in Grasshopper were simulated in SOFA for actuation and sensor-placement studies. Cushion generalizes that pipeline: any closed solid can become a simulated soft body, with materials, actuation, and boundary conditions assigned per component, and results flowing back for downstream design logic -- workspace analysis, grasp evaluation, or optimization loops.</w:t>
+        <w:t xml:space="preserve">The workflow grew out of the Monolithic Unit research pipeline (Exley, Nardin, Trunin, Cafiso and Beccai, 2025), in which soft pneumatic actuators designed parametrically in Grasshopper were simulated in SOFA for actuation and sensor-placement studies. Cushion generalizes that pipeline: any closed solid can become a simulated soft body, with materials, actuation, and boundary conditions assigned per component, and results flowing back for downstream design logic: workspace analysis, grasp evaluation, or optimization loops.</w:t>
       </w:r>
     </w:p>
     <w:p>
@@ -822,7 +822,7 @@
           <w:sz w:val="22"/>
           <w:szCs w:val="22"/>
         </w:rPr>
-        <w:t xml:space="preserve">V0.1 -- Initial release. Pneumatic and tendon actuation, local stiffening regions, rigid targets and contact, scene preview, trajectory monitoring, tendon telemetry, and deformed-shape playback. Requires the freely available SOFA binaries (v24.06).</w:t>
+        <w:t xml:space="preserve">V0.1: Initial release. Pneumatic and tendon actuation, local stiffening regions, rigid targets and contact, scene preview, trajectory monitoring, tendon telemetry, and deformed-shape playback. Requires the freely available SOFA binaries (v24.06).</w:t>
       </w:r>
     </w:p>
     <w:p>
@@ -956,7 +956,7 @@
         </w:rPr>
         <w:t xml:space="preserve">-  Rhino 8: </w:t>
       </w:r>
-      <w:hyperlink w:history="1" r:id="rId71loofo8bmwvhcl7rwxfs">
+      <w:hyperlink w:history="1" r:id="rId4z6g2tdob7pbj8jctodbd">
         <w:r>
           <w:rPr>
             <w:rFonts w:ascii="Helvetica" w:cs="Helvetica" w:eastAsia="Helvetica" w:hAnsi="Helvetica"/>
@@ -981,7 +981,7 @@
         </w:rPr>
         <w:t xml:space="preserve">-  SOFA v24.06 binaries: </w:t>
       </w:r>
-      <w:hyperlink w:history="1" r:id="rId9oe0rr5nhabi57osswlml">
+      <w:hyperlink w:history="1" r:id="rIdrotiqtesbtcverm90ywz_">
         <w:r>
           <w:rPr>
             <w:rFonts w:ascii="Helvetica" w:cs="Helvetica" w:eastAsia="Helvetica" w:hAnsi="Helvetica"/>
@@ -1006,7 +1006,7 @@
         </w:rPr>
         <w:t xml:space="preserve">-  Python 3.10 (python.org installer): </w:t>
       </w:r>
-      <w:hyperlink w:history="1" r:id="rIdzujjwz6jjbpvjzsiwzeii">
+      <w:hyperlink w:history="1" r:id="rIdoxexipwu5xxln4f2orgw_">
         <w:r>
           <w:rPr>
             <w:rFonts w:ascii="Helvetica" w:cs="Helvetica" w:eastAsia="Helvetica" w:hAnsi="Helvetica"/>
@@ -1031,7 +1031,7 @@
         </w:rPr>
         <w:t xml:space="preserve">-  Cushion repository &amp; issues: </w:t>
       </w:r>
-      <w:hyperlink w:history="1" r:id="rIdlp3emgl_5ivivgc16fg8c">
+      <w:hyperlink w:history="1" r:id="rId-ybhbzuhhrqfpk25makt6">
         <w:r>
           <w:rPr>
             <w:rFonts w:ascii="Helvetica" w:cs="Helvetica" w:eastAsia="Helvetica" w:hAnsi="Helvetica"/>
@@ -1056,7 +1056,7 @@
         </w:rPr>
         <w:t xml:space="preserve">-  Manual, examples, install guides: </w:t>
       </w:r>
-      <w:hyperlink w:history="1" r:id="rIdhk_qvfpxpf6lkaz9qchyd">
+      <w:hyperlink w:history="1" r:id="rIdmnltqr2_gcvuwhbjaw68n">
         <w:r>
           <w:rPr>
             <w:rFonts w:ascii="Helvetica" w:cs="Helvetica" w:eastAsia="Helvetica" w:hAnsi="Helvetica"/>
@@ -1120,7 +1120,7 @@
           <w:sz w:val="22"/>
           <w:szCs w:val="22"/>
         </w:rPr>
-        <w:t xml:space="preserve">Millimeters, kilopascals, kilograms, seconds. Gravity -9810 mm/s2 in world Z. Geometry passes from Rhino to SOFA 1:1 -- no transform, no unit conversion. The Rhino document must be in millimeters.</w:t>
+        <w:t xml:space="preserve">Millimeters, kilopascals, kilograms, seconds. Gravity -9810 mm/s2 in world Z. Geometry passes from Rhino to SOFA 1:1, no transform, no unit conversion. The Rhino document must be in millimeters.</w:t>
       </w:r>
     </w:p>
     <w:p>
@@ -1250,7 +1250,7 @@
           <w:sz w:val="22"/>
           <w:szCs w:val="22"/>
         </w:rPr>
-        <w:t xml:space="preserve">   SofaBody -- </w:t>
+        <w:t xml:space="preserve">   SofaBody: </w:t>
       </w:r>
       <w:r>
         <w:rPr>
@@ -1313,7 +1313,7 @@
           <w:sz w:val="22"/>
           <w:szCs w:val="22"/>
         </w:rPr>
-        <w:t xml:space="preserve">   SofaCavity -- </w:t>
+        <w:t xml:space="preserve">   SofaCavity: </w:t>
       </w:r>
       <w:r>
         <w:rPr>
@@ -1376,7 +1376,7 @@
           <w:sz w:val="22"/>
           <w:szCs w:val="22"/>
         </w:rPr>
-        <w:t xml:space="preserve">   SofaTendon -- </w:t>
+        <w:t xml:space="preserve">   SofaTendon: </w:t>
       </w:r>
       <w:r>
         <w:rPr>
@@ -1439,7 +1439,7 @@
           <w:sz w:val="22"/>
           <w:szCs w:val="22"/>
         </w:rPr>
-        <w:t xml:space="preserve">   SofaTendons -- </w:t>
+        <w:t xml:space="preserve">   SofaTendons: </w:t>
       </w:r>
       <w:r>
         <w:rPr>
@@ -1502,7 +1502,7 @@
           <w:sz w:val="22"/>
           <w:szCs w:val="22"/>
         </w:rPr>
-        <w:t xml:space="preserve">   SofaRegion -- </w:t>
+        <w:t xml:space="preserve">   SofaRegion: </w:t>
       </w:r>
       <w:r>
         <w:rPr>
@@ -1565,7 +1565,7 @@
           <w:sz w:val="22"/>
           <w:szCs w:val="22"/>
         </w:rPr>
-        <w:t xml:space="preserve">   SofaTarget -- </w:t>
+        <w:t xml:space="preserve">   SofaTarget: </w:t>
       </w:r>
       <w:r>
         <w:rPr>
@@ -1640,7 +1640,7 @@
           <w:sz w:val="22"/>
           <w:szCs w:val="22"/>
         </w:rPr>
-        <w:t xml:space="preserve">   PressureProfile -- </w:t>
+        <w:t xml:space="preserve">   PressureProfile: </w:t>
       </w:r>
       <w:r>
         <w:rPr>
@@ -1703,7 +1703,7 @@
           <w:sz w:val="22"/>
           <w:szCs w:val="22"/>
         </w:rPr>
-        <w:t xml:space="preserve">   SofaProfiles -- </w:t>
+        <w:t xml:space="preserve">   SofaProfiles: </w:t>
       </w:r>
       <w:r>
         <w:rPr>
@@ -1766,7 +1766,7 @@
           <w:sz w:val="22"/>
           <w:szCs w:val="22"/>
         </w:rPr>
-        <w:t xml:space="preserve">   SofaProtocol -- </w:t>
+        <w:t xml:space="preserve">   SofaProtocol: </w:t>
       </w:r>
       <w:r>
         <w:rPr>
@@ -1774,7 +1774,7 @@
           <w:sz w:val="22"/>
           <w:szCs w:val="22"/>
         </w:rPr>
-        <w:t xml:space="preserve">Keyframed rigid motion of a whole body over time -- a pick-and-place move: carry a gripper down, hold, and lift.</w:t>
+        <w:t xml:space="preserve">Keyframed rigid motion of a whole body over time, a pick-and-place move: carry a gripper down, hold, and lift.</w:t>
       </w:r>
     </w:p>
     <w:p>
@@ -1841,7 +1841,7 @@
           <w:sz w:val="22"/>
           <w:szCs w:val="22"/>
         </w:rPr>
-        <w:t xml:space="preserve">   SofaScene -- </w:t>
+        <w:t xml:space="preserve">   SofaScene: </w:t>
       </w:r>
       <w:r>
         <w:rPr>
@@ -1904,7 +1904,7 @@
           <w:sz w:val="22"/>
           <w:szCs w:val="22"/>
         </w:rPr>
-        <w:t xml:space="preserve">   SofaRun -- </w:t>
+        <w:t xml:space="preserve">   SofaRun: </w:t>
       </w:r>
       <w:r>
         <w:rPr>
@@ -1967,7 +1967,7 @@
           <w:sz w:val="22"/>
           <w:szCs w:val="22"/>
         </w:rPr>
-        <w:t xml:space="preserve">   SofaPreview -- </w:t>
+        <w:t xml:space="preserve">   SofaPreview: </w:t>
       </w:r>
       <w:r>
         <w:rPr>
@@ -2042,7 +2042,7 @@
           <w:sz w:val="22"/>
           <w:szCs w:val="22"/>
         </w:rPr>
-        <w:t xml:space="preserve">   SofaResults -- </w:t>
+        <w:t xml:space="preserve">   SofaResults: </w:t>
       </w:r>
       <w:r>
         <w:rPr>
@@ -2105,7 +2105,7 @@
           <w:sz w:val="22"/>
           <w:szCs w:val="22"/>
         </w:rPr>
-        <w:t xml:space="preserve">   SofaShape -- </w:t>
+        <w:t xml:space="preserve">   SofaShape: </w:t>
       </w:r>
       <w:r>
         <w:rPr>
@@ -10820,7 +10820,7 @@
           <w:sz w:val="22"/>
           <w:szCs w:val="22"/>
         </w:rPr>
-        <w:t xml:space="preserve">Keyframed rigid motion of a whole body over time -- a pick-and-place move: carry a gripper down, hold, and lift. The motion is applied through the body's rest positions, so the body is dragged by its fixations; a body without a fixation box will not follow.</w:t>
+        <w:t xml:space="preserve">Keyframed rigid motion of a whole body over time, a pick-and-place move: carry a gripper down, hold, and lift. The motion is applied through the body's rest positions, so the body is dragged by its fixations; a body without a fixation box will not follow.</w:t>
       </w:r>
     </w:p>
     <w:p>
@@ -11474,7 +11474,7 @@
           <w:sz w:val="20"/>
           <w:szCs w:val="20"/>
         </w:rPr>
-        <w:t xml:space="preserve">Notes: Time the actuation profiles to match the motion -- e.g. inflate the cavities while the offset holds at the object.</w:t>
+        <w:t xml:space="preserve">Notes: Time the actuation profiles to match the motion, e.g. inflate the cavities while the offset holds at the object.</w:t>
       </w:r>
     </w:p>
     <w:p>
@@ -16761,7 +16761,7 @@
                 <w:sz w:val="18"/>
                 <w:szCs w:val="18"/>
               </w:rPr>
-              <w:t xml:space="preserve">Nodal force (mN) at the monitor points, branch per frame -- the grip reaction where a point sits on a contact pad.</w:t>
+              <w:t xml:space="preserve">Nodal force (mN) at the monitor points, branch per frame (the grip reaction where a point sits on a contact pad).</w:t>
             </w:r>
           </w:p>
         </w:tc>
@@ -18798,7 +18798,7 @@
           <w:sz w:val="22"/>
           <w:szCs w:val="22"/>
         </w:rPr>
-        <w:t xml:space="preserve">4. Profiles: 13 keyframes per channel sweeping Tmax * max(0, cos(30 deg * k - phi)) -- the resultant pull direction rotates 360 degrees.</w:t>
+        <w:t xml:space="preserve">4. Profiles: 13 keyframes per channel sweeping Tmax * max(0, cos(30 deg * k - phi)); the resultant pull direction rotates 360 degrees.</w:t>
       </w:r>
     </w:p>
     <w:p>

</xml_diff>

<commit_message>
docs: Grasshopper tagline; plugin+Pufferfish install (drop authoring route); example canvas images; manual uses logo.svg render; remove dev-note mds
</commit_message>
<xml_diff>
--- a/docs/manual/Cushion_Manual.docx
+++ b/docs/manual/Cushion_Manual.docx
@@ -194,7 +194,7 @@
           <w:sz w:val="24"/>
           <w:szCs w:val="24"/>
         </w:rPr>
-        <w:t xml:space="preserve">Cushion is the soft layer between Rhino and SOFA.</w:t>
+        <w:t xml:space="preserve">Cushion is the soft layer between Grasshopper and SOFA.</w:t>
       </w:r>
     </w:p>
     <w:p>
@@ -282,7 +282,7 @@
         <w:spacing w:after="60"/>
         <w:jc w:val="center"/>
       </w:pPr>
-      <w:hyperlink w:history="1" r:id="rIdtu_mdnsqcd3p91h4gbftv">
+      <w:hyperlink w:history="1" r:id="rIdlag_osqegv7dzbncagj14">
         <w:r>
           <w:rPr>
             <w:rFonts w:ascii="Helvetica" w:cs="Helvetica" w:eastAsia="Helvetica" w:hAnsi="Helvetica"/>
@@ -302,7 +302,7 @@
         </w:rPr>
         <w:t xml:space="preserve">          </w:t>
       </w:r>
-      <w:hyperlink w:history="1" r:id="rIdw3hormnu7v-jjwrpvv580">
+      <w:hyperlink w:history="1" r:id="rId9-cefqhzr0w1zrpbueym7">
         <w:r>
           <w:rPr>
             <w:rFonts w:ascii="Helvetica" w:cs="Helvetica" w:eastAsia="Helvetica" w:hAnsi="Helvetica"/>
@@ -865,7 +865,7 @@
           <w:sz w:val="22"/>
           <w:szCs w:val="22"/>
         </w:rPr>
-        <w:t xml:space="preserve">-  SOFA v24.06 binaries with the SofaPython3, SoftRobots, STLIB and SofaValidation plugins (all included in the official release bundle from www.sofa-framework.org/download). Set the SOFA_ROOT environment variable to the installation folder, or wire the path into SofaRun.</w:t>
+        <w:t xml:space="preserve">-  Pufferfish plugin (free, on food4Rhino): the examples use its Reduce Mesh component.</w:t>
       </w:r>
     </w:p>
     <w:p>
@@ -878,7 +878,7 @@
           <w:sz w:val="22"/>
           <w:szCs w:val="22"/>
         </w:rPr>
-        <w:t xml:space="preserve">-  Python 3.10 with numpy, for SOFA's embedded interpreter (see the installation guide for per-platform steps; this is the most common setup issue).</w:t>
+        <w:t xml:space="preserve">-  SOFA v24.06.00 binaries with the SofaPython3, SoftRobots, STLIB and SofaValidation plugins (all included in the official release bundle). Use exactly v24.06.00 (SofaPython3 is built against a specific Python; other releases will not load the bundled plugins cleanly). Set the SOFA_ROOT environment variable to the installation folder, or wire the path into SofaRun.</w:t>
       </w:r>
     </w:p>
     <w:p>
@@ -891,6 +891,19 @@
           <w:sz w:val="22"/>
           <w:szCs w:val="22"/>
         </w:rPr>
+        <w:t xml:space="preserve">-  Python 3.10 with numpy, for SOFA's embedded interpreter (see the installation guide for per-platform steps; this is the most common setup issue).</w:t>
+      </w:r>
+    </w:p>
+    <w:p>
+      <w:pPr>
+        <w:spacing w:after="140"/>
+      </w:pPr>
+      <w:r>
+        <w:rPr>
+          <w:rFonts w:ascii="Helvetica" w:cs="Helvetica" w:eastAsia="Helvetica" w:hAnsi="Helvetica"/>
+          <w:sz w:val="22"/>
+          <w:szCs w:val="22"/>
+        </w:rPr>
         <w:t xml:space="preserve">-  Gmsh (Python package), installed once into Rhino's own Python: run "&lt;rhino-python&gt;" -m pip install gmsh (the rhino-python path is in the installation guide). Do not rely on automatic install.</w:t>
       </w:r>
     </w:p>
@@ -956,7 +969,7 @@
         </w:rPr>
         <w:t xml:space="preserve">-  Rhino 8: </w:t>
       </w:r>
-      <w:hyperlink w:history="1" r:id="rId4z6g2tdob7pbj8jctodbd">
+      <w:hyperlink w:history="1" r:id="rIdkdzfgyg8hvv_sehy_nmjr">
         <w:r>
           <w:rPr>
             <w:rFonts w:ascii="Helvetica" w:cs="Helvetica" w:eastAsia="Helvetica" w:hAnsi="Helvetica"/>
@@ -981,7 +994,7 @@
         </w:rPr>
         <w:t xml:space="preserve">-  SOFA v24.06 binaries: </w:t>
       </w:r>
-      <w:hyperlink w:history="1" r:id="rIdrotiqtesbtcverm90ywz_">
+      <w:hyperlink w:history="1" r:id="rIdcjvsz2bys5-c-1hfa-ii9">
         <w:r>
           <w:rPr>
             <w:rFonts w:ascii="Helvetica" w:cs="Helvetica" w:eastAsia="Helvetica" w:hAnsi="Helvetica"/>
@@ -1006,7 +1019,7 @@
         </w:rPr>
         <w:t xml:space="preserve">-  Python 3.10 (python.org installer): </w:t>
       </w:r>
-      <w:hyperlink w:history="1" r:id="rIdoxexipwu5xxln4f2orgw_">
+      <w:hyperlink w:history="1" r:id="rIdqfcrmuj_csibrkwtwnhlj">
         <w:r>
           <w:rPr>
             <w:rFonts w:ascii="Helvetica" w:cs="Helvetica" w:eastAsia="Helvetica" w:hAnsi="Helvetica"/>
@@ -1031,7 +1044,7 @@
         </w:rPr>
         <w:t xml:space="preserve">-  Cushion repository &amp; issues: </w:t>
       </w:r>
-      <w:hyperlink w:history="1" r:id="rId-ybhbzuhhrqfpk25makt6">
+      <w:hyperlink w:history="1" r:id="rIdh_83avi7ko1uds3nxwndp">
         <w:r>
           <w:rPr>
             <w:rFonts w:ascii="Helvetica" w:cs="Helvetica" w:eastAsia="Helvetica" w:hAnsi="Helvetica"/>
@@ -1056,7 +1069,7 @@
         </w:rPr>
         <w:t xml:space="preserve">-  Manual, examples, install guides: </w:t>
       </w:r>
-      <w:hyperlink w:history="1" r:id="rIdmnltqr2_gcvuwhbjaw68n">
+      <w:hyperlink w:history="1" r:id="rIdd9gcgne-rmp22xl9xbggs">
         <w:r>
           <w:rPr>
             <w:rFonts w:ascii="Helvetica" w:cs="Helvetica" w:eastAsia="Helvetica" w:hAnsi="Helvetica"/>

</xml_diff>

<commit_message>
docs: correct logo art; move Pufferfish to an examples note; wire GIF slots (README + examples) and docs/media
</commit_message>
<xml_diff>
--- a/docs/manual/Cushion_Manual.docx
+++ b/docs/manual/Cushion_Manual.docx
@@ -14,7 +14,7 @@
       <w:r>
         <w:drawing>
           <wp:inline distT="0" distB="0" distL="0" distR="0">
-            <wp:extent cx="2857500" cy="1876425"/>
+            <wp:extent cx="2857500" cy="2066925"/>
             <wp:effectExtent t="0" r="0" b="0" l="0"/>
             <wp:docPr id="1" name="" descr="" title=""/>
             <wp:cNvGraphicFramePr>
@@ -39,7 +39,7 @@
                   <pic:spPr bwMode="auto">
                     <a:xfrm>
                       <a:off x="0" y="0"/>
-                      <a:ext cx="2857500" cy="1876425"/>
+                      <a:ext cx="2857500" cy="2066925"/>
                     </a:xfrm>
                     <a:prstGeom prst="rect">
                       <a:avLst/>
@@ -282,7 +282,7 @@
         <w:spacing w:after="60"/>
         <w:jc w:val="center"/>
       </w:pPr>
-      <w:hyperlink w:history="1" r:id="rIdlag_osqegv7dzbncagj14">
+      <w:hyperlink w:history="1" r:id="rIdibvo8k9820nrzjbggwie1">
         <w:r>
           <w:rPr>
             <w:rFonts w:ascii="Helvetica" w:cs="Helvetica" w:eastAsia="Helvetica" w:hAnsi="Helvetica"/>
@@ -302,7 +302,7 @@
         </w:rPr>
         <w:t xml:space="preserve">          </w:t>
       </w:r>
-      <w:hyperlink w:history="1" r:id="rId9-cefqhzr0w1zrpbueym7">
+      <w:hyperlink w:history="1" r:id="rIdl42pothxnxeizmo36t7m0">
         <w:r>
           <w:rPr>
             <w:rFonts w:ascii="Helvetica" w:cs="Helvetica" w:eastAsia="Helvetica" w:hAnsi="Helvetica"/>
@@ -865,7 +865,7 @@
           <w:sz w:val="22"/>
           <w:szCs w:val="22"/>
         </w:rPr>
-        <w:t xml:space="preserve">-  Pufferfish plugin (free, on food4Rhino): the examples use its Reduce Mesh component.</w:t>
+        <w:t xml:space="preserve">-  SOFA v24.06.00 binaries with the SofaPython3, SoftRobots, STLIB and SofaValidation plugins (all included in the official release bundle). Use exactly v24.06.00 (SofaPython3 is built against a specific Python; other releases will not load the bundled plugins cleanly). Set the SOFA_ROOT environment variable to the installation folder, or wire the path into SofaRun.</w:t>
       </w:r>
     </w:p>
     <w:p>
@@ -878,7 +878,7 @@
           <w:sz w:val="22"/>
           <w:szCs w:val="22"/>
         </w:rPr>
-        <w:t xml:space="preserve">-  SOFA v24.06.00 binaries with the SofaPython3, SoftRobots, STLIB and SofaValidation plugins (all included in the official release bundle). Use exactly v24.06.00 (SofaPython3 is built against a specific Python; other releases will not load the bundled plugins cleanly). Set the SOFA_ROOT environment variable to the installation folder, or wire the path into SofaRun.</w:t>
+        <w:t xml:space="preserve">-  Python 3.10 with numpy, for SOFA's embedded interpreter (see the installation guide for per-platform steps; this is the most common setup issue).</w:t>
       </w:r>
     </w:p>
     <w:p>
@@ -891,7 +891,19 @@
           <w:sz w:val="22"/>
           <w:szCs w:val="22"/>
         </w:rPr>
-        <w:t xml:space="preserve">-  Python 3.10 with numpy, for SOFA's embedded interpreter (see the installation guide for per-platform steps; this is the most common setup issue).</w:t>
+        <w:t xml:space="preserve">-  Gmsh (Python package), installed once into Rhino's own Python: run "&lt;rhino-python&gt;" -m pip install gmsh (the rhino-python path is in the installation guide). Do not rely on automatic install.</w:t>
+      </w:r>
+    </w:p>
+    <w:p>
+      <w:pPr>
+        <w:pStyle w:val="Heading2"/>
+        <w:spacing w:after="200" w:before="240"/>
+      </w:pPr>
+      <w:r>
+        <w:rPr>
+          <w:rFonts w:ascii="Helvetica" w:cs="Helvetica" w:eastAsia="Helvetica" w:hAnsi="Helvetica"/>
+        </w:rPr>
+        <w:t xml:space="preserve">Installing Cushion</w:t>
       </w:r>
     </w:p>
     <w:p>
@@ -904,7 +916,20 @@
           <w:sz w:val="22"/>
           <w:szCs w:val="22"/>
         </w:rPr>
-        <w:t xml:space="preserve">-  Gmsh (Python package), installed once into Rhino's own Python: run "&lt;rhino-python&gt;" -m pip install gmsh (the rhino-python path is in the installation guide). Do not rely on automatic install.</w:t>
+        <w:t xml:space="preserve">-  From the Rhino Package Manager: run the _PackageManager command, search for Cushion, install, restart Rhino. The Cushion tab appears in Grasshopper.</w:t>
+      </w:r>
+    </w:p>
+    <w:p>
+      <w:pPr>
+        <w:spacing w:after="140"/>
+      </w:pPr>
+      <w:r>
+        <w:rPr>
+          <w:rFonts w:ascii="Helvetica" w:cs="Helvetica" w:eastAsia="Helvetica" w:hAnsi="Helvetica"/>
+          <w:sz w:val="22"/>
+          <w:szCs w:val="22"/>
+        </w:rPr>
+        <w:t xml:space="preserve">-  Or manually from food4Rhino: download the .gha file, then in Grasshopper open File &gt; Special Folders &gt; Components Folder, copy the .gha there. On Windows, right-click the downloaded file &gt; Properties &gt; Unblock before copying. Restart Rhino.</w:t>
       </w:r>
     </w:p>
     <w:p>
@@ -916,12 +941,12 @@
         <w:rPr>
           <w:rFonts w:ascii="Helvetica" w:cs="Helvetica" w:eastAsia="Helvetica" w:hAnsi="Helvetica"/>
         </w:rPr>
-        <w:t xml:space="preserve">Installing Cushion</w:t>
-      </w:r>
-    </w:p>
-    <w:p>
-      <w:pPr>
-        <w:spacing w:after="140"/>
+        <w:t xml:space="preserve">Links</w:t>
+      </w:r>
+    </w:p>
+    <w:p>
+      <w:pPr>
+        <w:spacing w:after="100"/>
       </w:pPr>
       <w:r>
         <w:rPr>
@@ -929,47 +954,9 @@
           <w:sz w:val="22"/>
           <w:szCs w:val="22"/>
         </w:rPr>
-        <w:t xml:space="preserve">-  From the Rhino Package Manager: run the _PackageManager command, search for Cushion, install, restart Rhino. The Cushion tab appears in Grasshopper.</w:t>
-      </w:r>
-    </w:p>
-    <w:p>
-      <w:pPr>
-        <w:spacing w:after="140"/>
-      </w:pPr>
-      <w:r>
-        <w:rPr>
-          <w:rFonts w:ascii="Helvetica" w:cs="Helvetica" w:eastAsia="Helvetica" w:hAnsi="Helvetica"/>
-          <w:sz w:val="22"/>
-          <w:szCs w:val="22"/>
-        </w:rPr>
-        <w:t xml:space="preserve">-  Or manually from food4Rhino: download the .gha file, then in Grasshopper open File &gt; Special Folders &gt; Components Folder, copy the .gha there. On Windows, right-click the downloaded file &gt; Properties &gt; Unblock before copying. Restart Rhino.</w:t>
-      </w:r>
-    </w:p>
-    <w:p>
-      <w:pPr>
-        <w:pStyle w:val="Heading2"/>
-        <w:spacing w:after="200" w:before="240"/>
-      </w:pPr>
-      <w:r>
-        <w:rPr>
-          <w:rFonts w:ascii="Helvetica" w:cs="Helvetica" w:eastAsia="Helvetica" w:hAnsi="Helvetica"/>
-        </w:rPr>
-        <w:t xml:space="preserve">Links</w:t>
-      </w:r>
-    </w:p>
-    <w:p>
-      <w:pPr>
-        <w:spacing w:after="100"/>
-      </w:pPr>
-      <w:r>
-        <w:rPr>
-          <w:rFonts w:ascii="Helvetica" w:cs="Helvetica" w:eastAsia="Helvetica" w:hAnsi="Helvetica"/>
-          <w:sz w:val="22"/>
-          <w:szCs w:val="22"/>
-        </w:rPr>
         <w:t xml:space="preserve">-  Rhino 8: </w:t>
       </w:r>
-      <w:hyperlink w:history="1" r:id="rIdkdzfgyg8hvv_sehy_nmjr">
+      <w:hyperlink w:history="1" r:id="rIdy2euxaf8a8kgnnwrp5buu">
         <w:r>
           <w:rPr>
             <w:rFonts w:ascii="Helvetica" w:cs="Helvetica" w:eastAsia="Helvetica" w:hAnsi="Helvetica"/>
@@ -994,7 +981,7 @@
         </w:rPr>
         <w:t xml:space="preserve">-  SOFA v24.06 binaries: </w:t>
       </w:r>
-      <w:hyperlink w:history="1" r:id="rIdcjvsz2bys5-c-1hfa-ii9">
+      <w:hyperlink w:history="1" r:id="rIdwsg_xdlosbjiwynyqmiz-">
         <w:r>
           <w:rPr>
             <w:rFonts w:ascii="Helvetica" w:cs="Helvetica" w:eastAsia="Helvetica" w:hAnsi="Helvetica"/>
@@ -1019,7 +1006,7 @@
         </w:rPr>
         <w:t xml:space="preserve">-  Python 3.10 (python.org installer): </w:t>
       </w:r>
-      <w:hyperlink w:history="1" r:id="rIdqfcrmuj_csibrkwtwnhlj">
+      <w:hyperlink w:history="1" r:id="rIden7gacn6cqw-5r07t1tw4">
         <w:r>
           <w:rPr>
             <w:rFonts w:ascii="Helvetica" w:cs="Helvetica" w:eastAsia="Helvetica" w:hAnsi="Helvetica"/>
@@ -1044,7 +1031,7 @@
         </w:rPr>
         <w:t xml:space="preserve">-  Cushion repository &amp; issues: </w:t>
       </w:r>
-      <w:hyperlink w:history="1" r:id="rIdh_83avi7ko1uds3nxwndp">
+      <w:hyperlink w:history="1" r:id="rIdhfs-wqgyn5glvm49jwrgy">
         <w:r>
           <w:rPr>
             <w:rFonts w:ascii="Helvetica" w:cs="Helvetica" w:eastAsia="Helvetica" w:hAnsi="Helvetica"/>
@@ -1069,7 +1056,7 @@
         </w:rPr>
         <w:t xml:space="preserve">-  Manual, examples, install guides: </w:t>
       </w:r>
-      <w:hyperlink w:history="1" r:id="rIdd9gcgne-rmp22xl9xbggs">
+      <w:hyperlink w:history="1" r:id="rIdv5pbs2v1sy9wlg5amvvzf">
         <w:r>
           <w:rPr>
             <w:rFonts w:ascii="Helvetica" w:cs="Helvetica" w:eastAsia="Helvetica" w:hAnsi="Helvetica"/>
@@ -18756,6 +18743,20 @@
           <w:szCs w:val="22"/>
         </w:rPr>
         <w:t xml:space="preserve">A cylindrical continuum robot with three tendons at 120 degrees, built entirely from native Grasshopper geometry, actuated with a rotating pull direction, and post-processed into a workspace boundary.</w:t>
+      </w:r>
+    </w:p>
+    <w:p>
+      <w:pPr>
+        <w:spacing w:after="160"/>
+        <w:jc w:val="left"/>
+      </w:pPr>
+      <w:r>
+        <w:rPr>
+          <w:rFonts w:ascii="Helvetica" w:cs="Helvetica" w:eastAsia="Helvetica" w:hAnsi="Helvetica"/>
+          <w:sz w:val="22"/>
+          <w:szCs w:val="22"/>
+        </w:rPr>
+        <w:t xml:space="preserve">Note: the examples use the Reduce Mesh component from the free Pufferfish plugin (food4Rhino); install it before opening them.</w:t>
       </w:r>
     </w:p>
     <w:p>

</xml_diff>

<commit_message>
manual: replace workflow tutorial with two short example entries + canvas screenshots
</commit_message>
<xml_diff>
--- a/docs/manual/Cushion_Manual.docx
+++ b/docs/manual/Cushion_Manual.docx
@@ -282,7 +282,7 @@
         <w:spacing w:after="60"/>
         <w:jc w:val="center"/>
       </w:pPr>
-      <w:hyperlink w:history="1" r:id="rIdibvo8k9820nrzjbggwie1">
+      <w:hyperlink w:history="1" r:id="rIdaimn-vn0_oiag8td6cca-">
         <w:r>
           <w:rPr>
             <w:rFonts w:ascii="Helvetica" w:cs="Helvetica" w:eastAsia="Helvetica" w:hAnsi="Helvetica"/>
@@ -302,7 +302,7 @@
         </w:rPr>
         <w:t xml:space="preserve">          </w:t>
       </w:r>
-      <w:hyperlink w:history="1" r:id="rIdl42pothxnxeizmo36t7m0">
+      <w:hyperlink w:history="1" r:id="rId2svy13noy5p4vjrbaq1kr">
         <w:r>
           <w:rPr>
             <w:rFonts w:ascii="Helvetica" w:cs="Helvetica" w:eastAsia="Helvetica" w:hAnsi="Helvetica"/>
@@ -763,7 +763,7 @@
           <w:sz w:val="24"/>
           <w:szCs w:val="24"/>
         </w:rPr>
-        <w:t xml:space="preserve">6. Workflow Example: Tendon-Driven Continuum Robot</w:t>
+        <w:t xml:space="preserve">6. Examples</w:t>
       </w:r>
     </w:p>
     <w:p>
@@ -956,7 +956,7 @@
         </w:rPr>
         <w:t xml:space="preserve">-  Rhino 8: </w:t>
       </w:r>
-      <w:hyperlink w:history="1" r:id="rIdy2euxaf8a8kgnnwrp5buu">
+      <w:hyperlink w:history="1" r:id="rIdaltr9sqdkgbr2flmqxac8">
         <w:r>
           <w:rPr>
             <w:rFonts w:ascii="Helvetica" w:cs="Helvetica" w:eastAsia="Helvetica" w:hAnsi="Helvetica"/>
@@ -981,7 +981,7 @@
         </w:rPr>
         <w:t xml:space="preserve">-  SOFA v24.06 binaries: </w:t>
       </w:r>
-      <w:hyperlink w:history="1" r:id="rIdwsg_xdlosbjiwynyqmiz-">
+      <w:hyperlink w:history="1" r:id="rIdplnewlyi3keugfoqrtytd">
         <w:r>
           <w:rPr>
             <w:rFonts w:ascii="Helvetica" w:cs="Helvetica" w:eastAsia="Helvetica" w:hAnsi="Helvetica"/>
@@ -1006,7 +1006,7 @@
         </w:rPr>
         <w:t xml:space="preserve">-  Python 3.10 (python.org installer): </w:t>
       </w:r>
-      <w:hyperlink w:history="1" r:id="rIden7gacn6cqw-5r07t1tw4">
+      <w:hyperlink w:history="1" r:id="rIdgcp8mzbc55xxnxfv7osbv">
         <w:r>
           <w:rPr>
             <w:rFonts w:ascii="Helvetica" w:cs="Helvetica" w:eastAsia="Helvetica" w:hAnsi="Helvetica"/>
@@ -1031,7 +1031,7 @@
         </w:rPr>
         <w:t xml:space="preserve">-  Cushion repository &amp; issues: </w:t>
       </w:r>
-      <w:hyperlink w:history="1" r:id="rIdhfs-wqgyn5glvm49jwrgy">
+      <w:hyperlink w:history="1" r:id="rIdgbmmy165sw3-8fjobehod">
         <w:r>
           <w:rPr>
             <w:rFonts w:ascii="Helvetica" w:cs="Helvetica" w:eastAsia="Helvetica" w:hAnsi="Helvetica"/>
@@ -1056,7 +1056,7 @@
         </w:rPr>
         <w:t xml:space="preserve">-  Manual, examples, install guides: </w:t>
       </w:r>
-      <w:hyperlink w:history="1" r:id="rIdv5pbs2v1sy9wlg5amvvzf">
+      <w:hyperlink w:history="1" r:id="rIdlfdvmfvq33ualskmprmrc">
         <w:r>
           <w:rPr>
             <w:rFonts w:ascii="Helvetica" w:cs="Helvetica" w:eastAsia="Helvetica" w:hAnsi="Helvetica"/>
@@ -18728,7 +18728,54 @@
         <w:rPr>
           <w:rFonts w:ascii="Helvetica" w:cs="Helvetica" w:eastAsia="Helvetica" w:hAnsi="Helvetica"/>
         </w:rPr>
-        <w:t xml:space="preserve">Workflow Example: Tendon-Driven Continuum Robot</w:t>
+        <w:t xml:space="preserve">Examples</w:t>
+      </w:r>
+    </w:p>
+    <w:p>
+      <w:pPr>
+        <w:spacing w:after="140"/>
+        <w:jc w:val="left"/>
+      </w:pPr>
+      <w:r>
+        <w:rPr>
+          <w:rFonts w:ascii="Helvetica" w:cs="Helvetica" w:eastAsia="Helvetica" w:hAnsi="Helvetica"/>
+          <w:sz w:val="22"/>
+          <w:szCs w:val="22"/>
+        </w:rPr>
+        <w:t xml:space="preserve">Two worked definitions ship with Cushion, in the examples folder of the repository (github.com/te5msride/cushion). Each has a full step-by-step walkthrough there; below is the complete Grasshopper canvas for each.</w:t>
+      </w:r>
+    </w:p>
+    <w:p>
+      <w:pPr>
+        <w:spacing w:after="260"/>
+        <w:jc w:val="left"/>
+      </w:pPr>
+      <w:r>
+        <w:rPr>
+          <w:rFonts w:ascii="Helvetica" w:cs="Helvetica" w:eastAsia="Helvetica" w:hAnsi="Helvetica"/>
+          <w:i/>
+          <w:iCs/>
+          <w:color w:val="666666"/>
+          <w:sz w:val="20"/>
+          <w:szCs w:val="20"/>
+        </w:rPr>
+        <w:t xml:space="preserve">Both examples use the Reduce Mesh component from the free Pufferfish plugin (food4Rhino); install it before opening them.</w:t>
+      </w:r>
+    </w:p>
+    <w:p>
+      <w:pPr>
+        <w:spacing w:after="100"/>
+        <w:jc w:val="left"/>
+      </w:pPr>
+      <w:r>
+        <w:rPr>
+          <w:rFonts w:ascii="Helvetica" w:cs="Helvetica" w:eastAsia="Helvetica" w:hAnsi="Helvetica"/>
+          <w:b/>
+          <w:bCs/>
+          <w:sz w:val="26"/>
+          <w:szCs w:val="26"/>
+        </w:rPr>
+        <w:t xml:space="preserve">Tendon-driven continuum robot</w:t>
       </w:r>
     </w:p>
     <w:p>
@@ -18742,7 +18789,84 @@
           <w:sz w:val="22"/>
           <w:szCs w:val="22"/>
         </w:rPr>
-        <w:t xml:space="preserve">A cylindrical continuum robot with three tendons at 120 degrees, built entirely from native Grasshopper geometry, actuated with a rotating pull direction, and post-processed into a workspace boundary.</w:t>
+        <w:t xml:space="preserve">A cylindrical backbone driven by three tendons at 0/120/240 degrees. One run sweeps the pull direction a full turn while the Monitor logs the backbone, and the convex hull of the tip cloud gives the workspace bounds.</w:t>
+      </w:r>
+    </w:p>
+    <w:p>
+      <w:pPr>
+        <w:spacing w:after="100"/>
+        <w:jc w:val="center"/>
+      </w:pPr>
+      <w:r>
+        <w:drawing>
+          <wp:inline distT="0" distB="0" distL="0" distR="0">
+            <wp:extent cx="5715000" cy="3609975"/>
+            <wp:effectExtent t="0" r="0" b="0" l="0"/>
+            <wp:docPr id="1" name="" descr="" title=""/>
+            <wp:cNvGraphicFramePr>
+              <a:graphicFrameLocks xmlns:a="http://schemas.openxmlformats.org/drawingml/2006/main" noChangeAspect="1"/>
+            </wp:cNvGraphicFramePr>
+            <a:graphic xmlns:a="http://schemas.openxmlformats.org/drawingml/2006/main">
+              <a:graphicData uri="http://schemas.openxmlformats.org/drawingml/2006/picture">
+                <pic:pic xmlns:pic="http://schemas.openxmlformats.org/drawingml/2006/picture">
+                  <pic:nvPicPr>
+                    <pic:cNvPr id="0" name="" descr=""/>
+                    <pic:cNvPicPr>
+                      <a:picLocks noChangeAspect="1" noChangeArrowheads="1"/>
+                    </pic:cNvPicPr>
+                  </pic:nvPicPr>
+                  <pic:blipFill>
+                    <a:blip r:embed="rId24" cstate="none"/>
+                    <a:srcRect/>
+                    <a:stretch>
+                      <a:fillRect/>
+                    </a:stretch>
+                  </pic:blipFill>
+                  <pic:spPr bwMode="auto">
+                    <a:xfrm>
+                      <a:off x="0" y="0"/>
+                      <a:ext cx="5715000" cy="3609975"/>
+                    </a:xfrm>
+                    <a:prstGeom prst="rect">
+                      <a:avLst/>
+                    </a:prstGeom>
+                  </pic:spPr>
+                </pic:pic>
+              </a:graphicData>
+            </a:graphic>
+          </wp:inline>
+        </w:drawing>
+      </w:r>
+    </w:p>
+    <w:p>
+      <w:pPr>
+        <w:spacing w:after="320"/>
+        <w:jc w:val="left"/>
+      </w:pPr>
+      <w:r>
+        <w:rPr>
+          <w:rFonts w:ascii="Helvetica" w:cs="Helvetica" w:eastAsia="Helvetica" w:hAnsi="Helvetica"/>
+          <w:color w:val="666666"/>
+          <w:sz w:val="20"/>
+          <w:szCs w:val="20"/>
+        </w:rPr>
+        <w:t xml:space="preserve">Full walkthrough: examples/continuum_robot.md</w:t>
+      </w:r>
+    </w:p>
+    <w:p>
+      <w:pPr>
+        <w:spacing w:after="100"/>
+        <w:jc w:val="left"/>
+      </w:pPr>
+      <w:r>
+        <w:rPr>
+          <w:rFonts w:ascii="Helvetica" w:cs="Helvetica" w:eastAsia="Helvetica" w:hAnsi="Helvetica"/>
+          <w:b/>
+          <w:bCs/>
+          <w:sz w:val="26"/>
+          <w:szCs w:val="26"/>
+        </w:rPr>
+        <w:t xml:space="preserve">PneuNet two-finger gripper</w:t>
       </w:r>
     </w:p>
     <w:p>
@@ -18756,7 +18880,53 @@
           <w:sz w:val="22"/>
           <w:szCs w:val="22"/>
         </w:rPr>
-        <w:t xml:space="preserve">Note: the examples use the Reduce Mesh component from the free Pufferfish plugin (food4Rhino); install it before opening them.</w:t>
+        <w:t xml:space="preserve">A fast-PneuNet finger whose chambers and profile are shaped by Graph Mappers; the cavities become internal voids automatically. One finger is oriented twice into a gripper and carried through a pick-and-place while the chambers inflate, grasping an object.</w:t>
+      </w:r>
+    </w:p>
+    <w:p>
+      <w:pPr>
+        <w:spacing w:after="100"/>
+        <w:jc w:val="center"/>
+      </w:pPr>
+      <w:r>
+        <w:drawing>
+          <wp:inline distT="0" distB="0" distL="0" distR="0">
+            <wp:extent cx="5715000" cy="2247900"/>
+            <wp:effectExtent t="0" r="0" b="0" l="0"/>
+            <wp:docPr id="1" name="" descr="" title=""/>
+            <wp:cNvGraphicFramePr>
+              <a:graphicFrameLocks xmlns:a="http://schemas.openxmlformats.org/drawingml/2006/main" noChangeAspect="1"/>
+            </wp:cNvGraphicFramePr>
+            <a:graphic xmlns:a="http://schemas.openxmlformats.org/drawingml/2006/main">
+              <a:graphicData uri="http://schemas.openxmlformats.org/drawingml/2006/picture">
+                <pic:pic xmlns:pic="http://schemas.openxmlformats.org/drawingml/2006/picture">
+                  <pic:nvPicPr>
+                    <pic:cNvPr id="0" name="" descr=""/>
+                    <pic:cNvPicPr>
+                      <a:picLocks noChangeAspect="1" noChangeArrowheads="1"/>
+                    </pic:cNvPicPr>
+                  </pic:nvPicPr>
+                  <pic:blipFill>
+                    <a:blip r:embed="rId25" cstate="none"/>
+                    <a:srcRect/>
+                    <a:stretch>
+                      <a:fillRect/>
+                    </a:stretch>
+                  </pic:blipFill>
+                  <pic:spPr bwMode="auto">
+                    <a:xfrm>
+                      <a:off x="0" y="0"/>
+                      <a:ext cx="5715000" cy="2247900"/>
+                    </a:xfrm>
+                    <a:prstGeom prst="rect">
+                      <a:avLst/>
+                    </a:prstGeom>
+                  </pic:spPr>
+                </pic:pic>
+              </a:graphicData>
+            </a:graphic>
+          </wp:inline>
+        </w:drawing>
       </w:r>
     </w:p>
     <w:p>
@@ -18767,94 +18937,11 @@
       <w:r>
         <w:rPr>
           <w:rFonts w:ascii="Helvetica" w:cs="Helvetica" w:eastAsia="Helvetica" w:hAnsi="Helvetica"/>
-          <w:sz w:val="22"/>
-          <w:szCs w:val="22"/>
-        </w:rPr>
-        <w:t xml:space="preserve">1. Body: Circle (r 12) &gt; Extrude (z 100) &gt; Cap Holes &gt; SofaBody (E 100 kPa, mass 0.03 kg).</w:t>
-      </w:r>
-    </w:p>
-    <w:p>
-      <w:pPr>
-        <w:spacing w:after="160"/>
-        <w:jc w:val="left"/>
-      </w:pPr>
-      <w:r>
-        <w:rPr>
-          <w:rFonts w:ascii="Helvetica" w:cs="Helvetica" w:eastAsia="Helvetica" w:hAnsi="Helvetica"/>
-          <w:sz w:val="22"/>
-          <w:szCs w:val="22"/>
-        </w:rPr>
-        <w:t xml:space="preserve">2. Tendons: three lines at radius 8, Divide Curve &gt; SofaTendons (tree input), valueType force.</w:t>
-      </w:r>
-    </w:p>
-    <w:p>
-      <w:pPr>
-        <w:spacing w:after="160"/>
-        <w:jc w:val="left"/>
-      </w:pPr>
-      <w:r>
-        <w:rPr>
-          <w:rFonts w:ascii="Helvetica" w:cs="Helvetica" w:eastAsia="Helvetica" w:hAnsi="Helvetica"/>
-          <w:sz w:val="22"/>
-          <w:szCs w:val="22"/>
-        </w:rPr>
-        <w:t xml:space="preserve">3. Fixation: box around the base; monitor points along the axis.</w:t>
-      </w:r>
-    </w:p>
-    <w:p>
-      <w:pPr>
-        <w:spacing w:after="160"/>
-        <w:jc w:val="left"/>
-      </w:pPr>
-      <w:r>
-        <w:rPr>
-          <w:rFonts w:ascii="Helvetica" w:cs="Helvetica" w:eastAsia="Helvetica" w:hAnsi="Helvetica"/>
-          <w:sz w:val="22"/>
-          <w:szCs w:val="22"/>
-        </w:rPr>
-        <w:t xml:space="preserve">4. Profiles: 13 keyframes per channel sweeping Tmax * max(0, cos(30 deg * k - phi)); the resultant pull direction rotates 360 degrees.</w:t>
-      </w:r>
-    </w:p>
-    <w:p>
-      <w:pPr>
-        <w:spacing w:after="160"/>
-        <w:jc w:val="left"/>
-      </w:pPr>
-      <w:r>
-        <w:rPr>
-          <w:rFonts w:ascii="Helvetica" w:cs="Helvetica" w:eastAsia="Helvetica" w:hAnsi="Helvetica"/>
-          <w:sz w:val="22"/>
-          <w:szCs w:val="22"/>
-        </w:rPr>
-        <w:t xml:space="preserve">5. SofaScene (gravity 0) &gt; SofaPreview to verify &gt; SofaRun.</w:t>
-      </w:r>
-    </w:p>
-    <w:p>
-      <w:pPr>
-        <w:spacing w:after="160"/>
-        <w:jc w:val="left"/>
-      </w:pPr>
-      <w:r>
-        <w:rPr>
-          <w:rFonts w:ascii="Helvetica" w:cs="Helvetica" w:eastAsia="Helvetica" w:hAnsi="Helvetica"/>
-          <w:sz w:val="22"/>
-          <w:szCs w:val="22"/>
-        </w:rPr>
-        <w:t xml:space="preserve">6. SofaResults: tip positions per frame &gt; convex hull = workspace bounds; cableForce/cableDisp confirm the commanded lobes.</w:t>
-      </w:r>
-    </w:p>
-    <w:p>
-      <w:pPr>
-        <w:spacing w:after="160"/>
-        <w:jc w:val="left"/>
-      </w:pPr>
-      <w:r>
-        <w:rPr>
-          <w:rFonts w:ascii="Helvetica" w:cs="Helvetica" w:eastAsia="Helvetica" w:hAnsi="Helvetica"/>
-          <w:sz w:val="22"/>
-          <w:szCs w:val="22"/>
-        </w:rPr>
-        <w:t xml:space="preserve">[screenshot placeholders: canvas, SOFA window, workspace hull]</w:t>
+          <w:color w:val="666666"/>
+          <w:sz w:val="20"/>
+          <w:szCs w:val="20"/>
+        </w:rPr>
+        <w:t xml:space="preserve">Full walkthrough: examples/pneunet_gripper.md</w:t>
       </w:r>
     </w:p>
     <w:sectPr>

</xml_diff>

<commit_message>
manual: fix blank pages (pageBreakBefore, no trailing breaks); examples link to GitHub walkthroughs instead of embedded canvases
</commit_message>
<xml_diff>
--- a/docs/manual/Cushion_Manual.docx
+++ b/docs/manual/Cushion_Manual.docx
@@ -282,7 +282,7 @@
         <w:spacing w:after="60"/>
         <w:jc w:val="center"/>
       </w:pPr>
-      <w:hyperlink w:history="1" r:id="rIdaimn-vn0_oiag8td6cca-">
+      <w:hyperlink w:history="1" r:id="rIdb2-snm7azqfbjbcarvfcz">
         <w:r>
           <w:rPr>
             <w:rFonts w:ascii="Helvetica" w:cs="Helvetica" w:eastAsia="Helvetica" w:hAnsi="Helvetica"/>
@@ -302,7 +302,7 @@
         </w:rPr>
         <w:t xml:space="preserve">          </w:t>
       </w:r>
-      <w:hyperlink w:history="1" r:id="rId2svy13noy5p4vjrbaq1kr">
+      <w:hyperlink w:history="1" r:id="rId45kasshfrxsup87blkkko">
         <w:r>
           <w:rPr>
             <w:rFonts w:ascii="Helvetica" w:cs="Helvetica" w:eastAsia="Helvetica" w:hAnsi="Helvetica"/>
@@ -956,7 +956,7 @@
         </w:rPr>
         <w:t xml:space="preserve">-  Rhino 8: </w:t>
       </w:r>
-      <w:hyperlink w:history="1" r:id="rIdaltr9sqdkgbr2flmqxac8">
+      <w:hyperlink w:history="1" r:id="rIdylirxhedjrs8tjzwjy4eg">
         <w:r>
           <w:rPr>
             <w:rFonts w:ascii="Helvetica" w:cs="Helvetica" w:eastAsia="Helvetica" w:hAnsi="Helvetica"/>
@@ -981,7 +981,7 @@
         </w:rPr>
         <w:t xml:space="preserve">-  SOFA v24.06 binaries: </w:t>
       </w:r>
-      <w:hyperlink w:history="1" r:id="rIdplnewlyi3keugfoqrtytd">
+      <w:hyperlink w:history="1" r:id="rIdaurqcqjvdyn3kliuhkeir">
         <w:r>
           <w:rPr>
             <w:rFonts w:ascii="Helvetica" w:cs="Helvetica" w:eastAsia="Helvetica" w:hAnsi="Helvetica"/>
@@ -1006,7 +1006,7 @@
         </w:rPr>
         <w:t xml:space="preserve">-  Python 3.10 (python.org installer): </w:t>
       </w:r>
-      <w:hyperlink w:history="1" r:id="rIdgcp8mzbc55xxnxfv7osbv">
+      <w:hyperlink w:history="1" r:id="rIdnuvfxr-xipy-al-vvsjtt">
         <w:r>
           <w:rPr>
             <w:rFonts w:ascii="Helvetica" w:cs="Helvetica" w:eastAsia="Helvetica" w:hAnsi="Helvetica"/>
@@ -1031,7 +1031,7 @@
         </w:rPr>
         <w:t xml:space="preserve">-  Cushion repository &amp; issues: </w:t>
       </w:r>
-      <w:hyperlink w:history="1" r:id="rIdgbmmy165sw3-8fjobehod">
+      <w:hyperlink w:history="1" r:id="rIdxsuk57ev1dwrtwnpp6if7">
         <w:r>
           <w:rPr>
             <w:rFonts w:ascii="Helvetica" w:cs="Helvetica" w:eastAsia="Helvetica" w:hAnsi="Helvetica"/>
@@ -1056,7 +1056,7 @@
         </w:rPr>
         <w:t xml:space="preserve">-  Manual, examples, install guides: </w:t>
       </w:r>
-      <w:hyperlink w:history="1" r:id="rIdlfdvmfvq33ualskmprmrc">
+      <w:hyperlink w:history="1" r:id="rId2_tv4cl831dtfutugnzzy">
         <w:r>
           <w:rPr>
             <w:rFonts w:ascii="Helvetica" w:cs="Helvetica" w:eastAsia="Helvetica" w:hAnsi="Helvetica"/>
@@ -4334,12 +4334,8 @@
       </w:r>
     </w:p>
     <w:p>
-      <w:r>
-        <w:br w:type="page"/>
-      </w:r>
-    </w:p>
-    <w:p>
-      <w:pPr>
+      <w:pPr>
+        <w:pageBreakBefore/>
         <w:spacing w:after="100" w:before="200"/>
       </w:pPr>
       <w:r>
@@ -5163,12 +5159,8 @@
       </w:r>
     </w:p>
     <w:p>
-      <w:r>
-        <w:br w:type="page"/>
-      </w:r>
-    </w:p>
-    <w:p>
-      <w:pPr>
+      <w:pPr>
+        <w:pageBreakBefore/>
         <w:spacing w:after="100" w:before="200"/>
       </w:pPr>
       <w:r>
@@ -6250,12 +6242,8 @@
       </w:r>
     </w:p>
     <w:p>
-      <w:r>
-        <w:br w:type="page"/>
-      </w:r>
-    </w:p>
-    <w:p>
-      <w:pPr>
+      <w:pPr>
+        <w:pageBreakBefore/>
         <w:spacing w:after="100" w:before="200"/>
       </w:pPr>
       <w:r>
@@ -7135,12 +7123,8 @@
       </w:tr>
     </w:tbl>
     <w:p>
-      <w:r>
-        <w:br w:type="page"/>
-      </w:r>
-    </w:p>
-    <w:p>
-      <w:pPr>
+      <w:pPr>
+        <w:pageBreakBefore/>
         <w:spacing w:after="100" w:before="200"/>
       </w:pPr>
       <w:r>
@@ -8364,12 +8348,8 @@
       </w:tr>
     </w:tbl>
     <w:p>
-      <w:r>
-        <w:br w:type="page"/>
-      </w:r>
-    </w:p>
-    <w:p>
-      <w:pPr>
+      <w:pPr>
+        <w:pageBreakBefore/>
         <w:spacing w:after="100" w:before="200"/>
       </w:pPr>
       <w:r>
@@ -9193,12 +9173,8 @@
       </w:r>
     </w:p>
     <w:p>
-      <w:r>
-        <w:br w:type="page"/>
-      </w:r>
-    </w:p>
-    <w:p>
-      <w:pPr>
+      <w:pPr>
+        <w:pageBreakBefore/>
         <w:spacing w:after="100" w:before="200"/>
       </w:pPr>
       <w:r>
@@ -9936,12 +9912,8 @@
       </w:r>
     </w:p>
     <w:p>
-      <w:r>
-        <w:br w:type="page"/>
-      </w:r>
-    </w:p>
-    <w:p>
-      <w:pPr>
+      <w:pPr>
+        <w:pageBreakBefore/>
         <w:spacing w:after="100" w:before="200"/>
       </w:pPr>
       <w:r>
@@ -10735,12 +10707,8 @@
       </w:tr>
     </w:tbl>
     <w:p>
-      <w:r>
-        <w:br w:type="page"/>
-      </w:r>
-    </w:p>
-    <w:p>
-      <w:pPr>
+      <w:pPr>
+        <w:pageBreakBefore/>
         <w:spacing w:after="100" w:before="200"/>
       </w:pPr>
       <w:r>
@@ -11478,12 +11446,8 @@
       </w:r>
     </w:p>
     <w:p>
-      <w:r>
-        <w:br w:type="page"/>
-      </w:r>
-    </w:p>
-    <w:p>
-      <w:pPr>
+      <w:pPr>
+        <w:pageBreakBefore/>
         <w:spacing w:after="100" w:before="200"/>
       </w:pPr>
       <w:r>
@@ -13253,12 +13217,8 @@
       </w:r>
     </w:p>
     <w:p>
-      <w:r>
-        <w:br w:type="page"/>
-      </w:r>
-    </w:p>
-    <w:p>
-      <w:pPr>
+      <w:pPr>
+        <w:pageBreakBefore/>
         <w:spacing w:after="100" w:before="200"/>
       </w:pPr>
       <w:r>
@@ -14224,12 +14184,8 @@
       </w:tr>
     </w:tbl>
     <w:p>
-      <w:r>
-        <w:br w:type="page"/>
-      </w:r>
-    </w:p>
-    <w:p>
-      <w:pPr>
+      <w:pPr>
+        <w:pageBreakBefore/>
         <w:spacing w:after="100" w:before="200"/>
       </w:pPr>
       <w:r>
@@ -15625,12 +15581,8 @@
       </w:tr>
     </w:tbl>
     <w:p>
-      <w:r>
-        <w:br w:type="page"/>
-      </w:r>
-    </w:p>
-    <w:p>
-      <w:pPr>
+      <w:pPr>
+        <w:pageBreakBefore/>
         <w:spacing w:after="100" w:before="200"/>
       </w:pPr>
       <w:r>
@@ -17572,12 +17524,8 @@
       </w:r>
     </w:p>
     <w:p>
-      <w:r>
-        <w:br w:type="page"/>
-      </w:r>
-    </w:p>
-    <w:p>
-      <w:pPr>
+      <w:pPr>
+        <w:pageBreakBefore/>
         <w:spacing w:after="100" w:before="200"/>
       </w:pPr>
       <w:r>
@@ -18742,7 +18690,7 @@
           <w:sz w:val="22"/>
           <w:szCs w:val="22"/>
         </w:rPr>
-        <w:t xml:space="preserve">Two worked definitions ship with Cushion, in the examples folder of the repository (github.com/te5msride/cushion). Each has a full step-by-step walkthrough there; below is the complete Grasshopper canvas for each.</w:t>
+        <w:t xml:space="preserve">Two worked definitions ship with Cushion, each with a full step-by-step walkthrough (an annotated, zoomable canvas screenshot and notes) on GitHub.</w:t>
       </w:r>
     </w:p>
     <w:p>
@@ -18780,7 +18728,7 @@
     </w:p>
     <w:p>
       <w:pPr>
-        <w:spacing w:after="160"/>
+        <w:spacing w:after="120"/>
         <w:jc w:val="left"/>
       </w:pPr>
       <w:r>
@@ -18794,64 +18742,28 @@
     </w:p>
     <w:p>
       <w:pPr>
-        <w:spacing w:after="100"/>
-        <w:jc w:val="center"/>
-      </w:pPr>
-      <w:r>
-        <w:drawing>
-          <wp:inline distT="0" distB="0" distL="0" distR="0">
-            <wp:extent cx="5715000" cy="3609975"/>
-            <wp:effectExtent t="0" r="0" b="0" l="0"/>
-            <wp:docPr id="1" name="" descr="" title=""/>
-            <wp:cNvGraphicFramePr>
-              <a:graphicFrameLocks xmlns:a="http://schemas.openxmlformats.org/drawingml/2006/main" noChangeAspect="1"/>
-            </wp:cNvGraphicFramePr>
-            <a:graphic xmlns:a="http://schemas.openxmlformats.org/drawingml/2006/main">
-              <a:graphicData uri="http://schemas.openxmlformats.org/drawingml/2006/picture">
-                <pic:pic xmlns:pic="http://schemas.openxmlformats.org/drawingml/2006/picture">
-                  <pic:nvPicPr>
-                    <pic:cNvPr id="0" name="" descr=""/>
-                    <pic:cNvPicPr>
-                      <a:picLocks noChangeAspect="1" noChangeArrowheads="1"/>
-                    </pic:cNvPicPr>
-                  </pic:nvPicPr>
-                  <pic:blipFill>
-                    <a:blip r:embed="rId24" cstate="none"/>
-                    <a:srcRect/>
-                    <a:stretch>
-                      <a:fillRect/>
-                    </a:stretch>
-                  </pic:blipFill>
-                  <pic:spPr bwMode="auto">
-                    <a:xfrm>
-                      <a:off x="0" y="0"/>
-                      <a:ext cx="5715000" cy="3609975"/>
-                    </a:xfrm>
-                    <a:prstGeom prst="rect">
-                      <a:avLst/>
-                    </a:prstGeom>
-                  </pic:spPr>
-                </pic:pic>
-              </a:graphicData>
-            </a:graphic>
-          </wp:inline>
-        </w:drawing>
-      </w:r>
-    </w:p>
-    <w:p>
-      <w:pPr>
-        <w:spacing w:after="320"/>
-        <w:jc w:val="left"/>
-      </w:pPr>
-      <w:r>
-        <w:rPr>
-          <w:rFonts w:ascii="Helvetica" w:cs="Helvetica" w:eastAsia="Helvetica" w:hAnsi="Helvetica"/>
-          <w:color w:val="666666"/>
-          <w:sz w:val="20"/>
-          <w:szCs w:val="20"/>
-        </w:rPr>
-        <w:t xml:space="preserve">Full walkthrough: examples/continuum_robot.md</w:t>
-      </w:r>
+        <w:spacing w:after="300"/>
+      </w:pPr>
+      <w:r>
+        <w:rPr>
+          <w:rFonts w:ascii="Helvetica" w:cs="Helvetica" w:eastAsia="Helvetica" w:hAnsi="Helvetica"/>
+          <w:sz w:val="22"/>
+          <w:szCs w:val="22"/>
+        </w:rPr>
+        <w:t xml:space="preserve">Walkthrough: </w:t>
+      </w:r>
+      <w:hyperlink w:history="1" r:id="rIdpbr8adwfdrnh3zzkiuzqz">
+        <w:r>
+          <w:rPr>
+            <w:rFonts w:ascii="Helvetica" w:cs="Helvetica" w:eastAsia="Helvetica" w:hAnsi="Helvetica"/>
+            <w:color w:val="0563C1"/>
+            <w:sz w:val="22"/>
+            <w:szCs w:val="22"/>
+            <w:u w:val="single"/>
+          </w:rPr>
+          <w:t xml:space="preserve">github.com/te5msride/cushion/blob/master/examples/continuum_robot.md</w:t>
+        </w:r>
+      </w:hyperlink>
     </w:p>
     <w:p>
       <w:pPr>
@@ -18871,7 +18783,7 @@
     </w:p>
     <w:p>
       <w:pPr>
-        <w:spacing w:after="160"/>
+        <w:spacing w:after="120"/>
         <w:jc w:val="left"/>
       </w:pPr>
       <w:r>
@@ -18885,64 +18797,28 @@
     </w:p>
     <w:p>
       <w:pPr>
-        <w:spacing w:after="100"/>
-        <w:jc w:val="center"/>
-      </w:pPr>
-      <w:r>
-        <w:drawing>
-          <wp:inline distT="0" distB="0" distL="0" distR="0">
-            <wp:extent cx="5715000" cy="2247900"/>
-            <wp:effectExtent t="0" r="0" b="0" l="0"/>
-            <wp:docPr id="1" name="" descr="" title=""/>
-            <wp:cNvGraphicFramePr>
-              <a:graphicFrameLocks xmlns:a="http://schemas.openxmlformats.org/drawingml/2006/main" noChangeAspect="1"/>
-            </wp:cNvGraphicFramePr>
-            <a:graphic xmlns:a="http://schemas.openxmlformats.org/drawingml/2006/main">
-              <a:graphicData uri="http://schemas.openxmlformats.org/drawingml/2006/picture">
-                <pic:pic xmlns:pic="http://schemas.openxmlformats.org/drawingml/2006/picture">
-                  <pic:nvPicPr>
-                    <pic:cNvPr id="0" name="" descr=""/>
-                    <pic:cNvPicPr>
-                      <a:picLocks noChangeAspect="1" noChangeArrowheads="1"/>
-                    </pic:cNvPicPr>
-                  </pic:nvPicPr>
-                  <pic:blipFill>
-                    <a:blip r:embed="rId25" cstate="none"/>
-                    <a:srcRect/>
-                    <a:stretch>
-                      <a:fillRect/>
-                    </a:stretch>
-                  </pic:blipFill>
-                  <pic:spPr bwMode="auto">
-                    <a:xfrm>
-                      <a:off x="0" y="0"/>
-                      <a:ext cx="5715000" cy="2247900"/>
-                    </a:xfrm>
-                    <a:prstGeom prst="rect">
-                      <a:avLst/>
-                    </a:prstGeom>
-                  </pic:spPr>
-                </pic:pic>
-              </a:graphicData>
-            </a:graphic>
-          </wp:inline>
-        </w:drawing>
-      </w:r>
-    </w:p>
-    <w:p>
-      <w:pPr>
         <w:spacing w:after="160"/>
-        <w:jc w:val="left"/>
-      </w:pPr>
-      <w:r>
-        <w:rPr>
-          <w:rFonts w:ascii="Helvetica" w:cs="Helvetica" w:eastAsia="Helvetica" w:hAnsi="Helvetica"/>
-          <w:color w:val="666666"/>
-          <w:sz w:val="20"/>
-          <w:szCs w:val="20"/>
-        </w:rPr>
-        <w:t xml:space="preserve">Full walkthrough: examples/pneunet_gripper.md</w:t>
-      </w:r>
+      </w:pPr>
+      <w:r>
+        <w:rPr>
+          <w:rFonts w:ascii="Helvetica" w:cs="Helvetica" w:eastAsia="Helvetica" w:hAnsi="Helvetica"/>
+          <w:sz w:val="22"/>
+          <w:szCs w:val="22"/>
+        </w:rPr>
+        <w:t xml:space="preserve">Walkthrough: </w:t>
+      </w:r>
+      <w:hyperlink w:history="1" r:id="rIdyv1mmac5glmowwanaagpd">
+        <w:r>
+          <w:rPr>
+            <w:rFonts w:ascii="Helvetica" w:cs="Helvetica" w:eastAsia="Helvetica" w:hAnsi="Helvetica"/>
+            <w:color w:val="0563C1"/>
+            <w:sz w:val="22"/>
+            <w:szCs w:val="22"/>
+            <w:u w:val="single"/>
+          </w:rPr>
+          <w:t xml:space="preserve">github.com/te5msride/cushion/blob/master/examples/pneunet_gripper.md</w:t>
+        </w:r>
+      </w:hyperlink>
     </w:p>
     <w:sectPr>
       <w:pgSz w:w="12240" w:h="15840" w:orient="portrait"/>

</xml_diff>

<commit_message>
docs: add food4Rhino app link (README, INSTALL, manual); fix Anderson Nardin in citation metadata
</commit_message>
<xml_diff>
--- a/docs/manual/Cushion_Manual.docx
+++ b/docs/manual/Cushion_Manual.docx
@@ -282,7 +282,7 @@
         <w:spacing w:after="60"/>
         <w:jc w:val="center"/>
       </w:pPr>
-      <w:hyperlink w:history="1" r:id="rIdb2-snm7azqfbjbcarvfcz">
+      <w:hyperlink w:history="1" r:id="rIdqjekxy8jjut2dtpq2gl20">
         <w:r>
           <w:rPr>
             <w:rFonts w:ascii="Helvetica" w:cs="Helvetica" w:eastAsia="Helvetica" w:hAnsi="Helvetica"/>
@@ -302,7 +302,7 @@
         </w:rPr>
         <w:t xml:space="preserve">          </w:t>
       </w:r>
-      <w:hyperlink w:history="1" r:id="rId45kasshfrxsup87blkkko">
+      <w:hyperlink w:history="1" r:id="rIdzmmjvxvh8jrpg2rpw-kbq">
         <w:r>
           <w:rPr>
             <w:rFonts w:ascii="Helvetica" w:cs="Helvetica" w:eastAsia="Helvetica" w:hAnsi="Helvetica"/>
@@ -954,9 +954,34 @@
           <w:sz w:val="22"/>
           <w:szCs w:val="22"/>
         </w:rPr>
+        <w:t xml:space="preserve">-  Cushion on food4Rhino: </w:t>
+      </w:r>
+      <w:hyperlink w:history="1" r:id="rIdex1sg_wr5vyt16izlserv">
+        <w:r>
+          <w:rPr>
+            <w:rFonts w:ascii="Helvetica" w:cs="Helvetica" w:eastAsia="Helvetica" w:hAnsi="Helvetica"/>
+            <w:color w:val="0563C1"/>
+            <w:sz w:val="22"/>
+            <w:szCs w:val="22"/>
+            <w:u w:val="single"/>
+          </w:rPr>
+          <w:t xml:space="preserve">food4rhino.com/en/app/cushion</w:t>
+        </w:r>
+      </w:hyperlink>
+    </w:p>
+    <w:p>
+      <w:pPr>
+        <w:spacing w:after="100"/>
+      </w:pPr>
+      <w:r>
+        <w:rPr>
+          <w:rFonts w:ascii="Helvetica" w:cs="Helvetica" w:eastAsia="Helvetica" w:hAnsi="Helvetica"/>
+          <w:sz w:val="22"/>
+          <w:szCs w:val="22"/>
+        </w:rPr>
         <w:t xml:space="preserve">-  Rhino 8: </w:t>
       </w:r>
-      <w:hyperlink w:history="1" r:id="rIdylirxhedjrs8tjzwjy4eg">
+      <w:hyperlink w:history="1" r:id="rIdgiadkzptu13pptt7qpecw">
         <w:r>
           <w:rPr>
             <w:rFonts w:ascii="Helvetica" w:cs="Helvetica" w:eastAsia="Helvetica" w:hAnsi="Helvetica"/>
@@ -981,7 +1006,7 @@
         </w:rPr>
         <w:t xml:space="preserve">-  SOFA v24.06 binaries: </w:t>
       </w:r>
-      <w:hyperlink w:history="1" r:id="rIdaurqcqjvdyn3kliuhkeir">
+      <w:hyperlink w:history="1" r:id="rIdms5lsvvoycjtvciygtpvd">
         <w:r>
           <w:rPr>
             <w:rFonts w:ascii="Helvetica" w:cs="Helvetica" w:eastAsia="Helvetica" w:hAnsi="Helvetica"/>
@@ -1006,7 +1031,7 @@
         </w:rPr>
         <w:t xml:space="preserve">-  Python 3.10 (python.org installer): </w:t>
       </w:r>
-      <w:hyperlink w:history="1" r:id="rIdnuvfxr-xipy-al-vvsjtt">
+      <w:hyperlink w:history="1" r:id="rIdgazlqxpwepzrowgefclsz">
         <w:r>
           <w:rPr>
             <w:rFonts w:ascii="Helvetica" w:cs="Helvetica" w:eastAsia="Helvetica" w:hAnsi="Helvetica"/>
@@ -1031,7 +1056,7 @@
         </w:rPr>
         <w:t xml:space="preserve">-  Cushion repository &amp; issues: </w:t>
       </w:r>
-      <w:hyperlink w:history="1" r:id="rIdxsuk57ev1dwrtwnpp6if7">
+      <w:hyperlink w:history="1" r:id="rIdpljd-auhmvjofzv7ic0al">
         <w:r>
           <w:rPr>
             <w:rFonts w:ascii="Helvetica" w:cs="Helvetica" w:eastAsia="Helvetica" w:hAnsi="Helvetica"/>
@@ -1056,7 +1081,7 @@
         </w:rPr>
         <w:t xml:space="preserve">-  Manual, examples, install guides: </w:t>
       </w:r>
-      <w:hyperlink w:history="1" r:id="rId2_tv4cl831dtfutugnzzy">
+      <w:hyperlink w:history="1" r:id="rIdwqw8avsg3bz0is6fu3bhy">
         <w:r>
           <w:rPr>
             <w:rFonts w:ascii="Helvetica" w:cs="Helvetica" w:eastAsia="Helvetica" w:hAnsi="Helvetica"/>
@@ -18752,7 +18777,7 @@
         </w:rPr>
         <w:t xml:space="preserve">Walkthrough: </w:t>
       </w:r>
-      <w:hyperlink w:history="1" r:id="rIdpbr8adwfdrnh3zzkiuzqz">
+      <w:hyperlink w:history="1" r:id="rIdhterm5w7bejaypnbjuetx">
         <w:r>
           <w:rPr>
             <w:rFonts w:ascii="Helvetica" w:cs="Helvetica" w:eastAsia="Helvetica" w:hAnsi="Helvetica"/>
@@ -18807,7 +18832,7 @@
         </w:rPr>
         <w:t xml:space="preserve">Walkthrough: </w:t>
       </w:r>
-      <w:hyperlink w:history="1" r:id="rIdyv1mmac5glmowwanaagpd">
+      <w:hyperlink w:history="1" r:id="rId-hastukq3l9ynibja7l9m">
         <w:r>
           <w:rPr>
             <w:rFonts w:ascii="Helvetica" w:cs="Helvetica" w:eastAsia="Helvetica" w:hAnsi="Helvetica"/>

</xml_diff>